<commit_message>
Requirements spec v1.1: add AI chat assistant section (C1-C25)
Covers scope, grounded answers and no invented specs/prices, human
hand-over, lead capture, accessibility and performance, server-side keys,
abuse and prompt-injection protection, cost caps, privacy/DPDP/GDPR, logs,
admin reporting; plus matching scope, bandwidth, acceptance and quotation items.

Co-Authored-By: Claude Opus 5.5 <noreply@anthropic.com>
Claude-Session: https://claude.ai/code/session_01WABZUxAxqMokFenf9DFzRQ
</commit_message>
<xml_diff>
--- a/docs/HYT-Website-Requirements-Specification.docx
+++ b/docs/HYT-Website-Requirements-Specification.docx
@@ -235,7 +235,7 @@
                 <w:sz w:val="19"/>
                 <w:szCs w:val="19"/>
               </w:rPr>
-              <w:t xml:space="preserve">1.0 – 15 October 2026</w:t>
+              <w:t xml:space="preserve">1.1 – 15 October 2026 (adds AI chat assistant)</w:t>
             </w:r>
           </w:p>
         </w:tc>
@@ -513,7 +513,7 @@
           <w:sz w:val="23"/>
           <w:szCs w:val="23"/>
         </w:rPr>
-        <w:t xml:space="preserve">7. Performance, accessibility and compatibility</w:t>
+        <w:t xml:space="preserve">7. AI chat assistant for visitors</w:t>
       </w:r>
     </w:p>
     <w:p>
@@ -527,7 +527,7 @@
           <w:sz w:val="23"/>
           <w:szCs w:val="23"/>
         </w:rPr>
-        <w:t xml:space="preserve">8. SEO and launch requirements</w:t>
+        <w:t xml:space="preserve">8. Performance, accessibility and compatibility</w:t>
       </w:r>
     </w:p>
     <w:p>
@@ -541,7 +541,7 @@
           <w:sz w:val="23"/>
           <w:szCs w:val="23"/>
         </w:rPr>
-        <w:t xml:space="preserve">9. Maintenance and support (SLA)</w:t>
+        <w:t xml:space="preserve">9. SEO and launch requirements</w:t>
       </w:r>
     </w:p>
     <w:p>
@@ -555,7 +555,7 @@
           <w:sz w:val="23"/>
           <w:szCs w:val="23"/>
         </w:rPr>
-        <w:t xml:space="preserve">10. Deliverables and acceptance criteria</w:t>
+        <w:t xml:space="preserve">10. Maintenance and support (SLA)</w:t>
       </w:r>
     </w:p>
     <w:p>
@@ -569,7 +569,7 @@
           <w:sz w:val="23"/>
           <w:szCs w:val="23"/>
         </w:rPr>
-        <w:t xml:space="preserve">11. What the vendor must include in the quotation</w:t>
+        <w:t xml:space="preserve">11. Deliverables and acceptance criteria</w:t>
       </w:r>
     </w:p>
     <w:p>
@@ -583,7 +583,21 @@
           <w:sz w:val="23"/>
           <w:szCs w:val="23"/>
         </w:rPr>
-        <w:t xml:space="preserve">12. Items HYT will provide</w:t>
+        <w:t xml:space="preserve">12. What the vendor must include in the quotation</w:t>
+      </w:r>
+    </w:p>
+    <w:p>
+      <w:pPr>
+        <w:spacing w:after="160"/>
+      </w:pPr>
+      <w:r>
+        <w:rPr>
+          <w:rFonts w:ascii="Arial" w:cs="Arial" w:eastAsia="Arial" w:hAnsi="Arial"/>
+          <w:color w:val="2E3338"/>
+          <w:sz w:val="23"/>
+          <w:szCs w:val="23"/>
+        </w:rPr>
+        <w:t xml:space="preserve">13. Items HYT will provide</w:t>
       </w:r>
     </w:p>
     <w:p>
@@ -1004,6 +1018,34 @@
           <w:sz w:val="21"/>
           <w:szCs w:val="21"/>
         </w:rPr>
+        <w:t xml:space="preserve">AI chat assistant for visitor assistance (section 7) – phase 2, quote separately – </w:t>
+      </w:r>
+      <w:r>
+        <w:rPr>
+          <w:rFonts w:ascii="Arial" w:cs="Arial" w:eastAsia="Arial" w:hAnsi="Arial"/>
+          <w:b/>
+          <w:bCs/>
+          <w:sz w:val="21"/>
+          <w:szCs w:val="21"/>
+        </w:rPr>
+        <w:t xml:space="preserve">MUST</w:t>
+      </w:r>
+    </w:p>
+    <w:p>
+      <w:pPr>
+        <w:pStyle w:val="ListParagraph"/>
+        <w:numPr>
+          <w:ilvl w:val="0"/>
+          <w:numId w:val="2"/>
+        </w:numPr>
+        <w:spacing w:after="60" w:line="264"/>
+      </w:pPr>
+      <w:r>
+        <w:rPr>
+          <w:rFonts w:ascii="Arial" w:cs="Arial" w:eastAsia="Arial" w:hAnsi="Arial"/>
+          <w:sz w:val="21"/>
+          <w:szCs w:val="21"/>
+        </w:rPr>
         <w:t xml:space="preserve">Web analytics with cookie consent – </w:t>
       </w:r>
       <w:r>
@@ -2461,7 +2503,7 @@
                 <w:sz w:val="19"/>
                 <w:szCs w:val="19"/>
               </w:rPr>
-              <w:t xml:space="preserve">Site search, product filter, galleries, videos and accordions work in all supported browsers (section 7).</w:t>
+              <w:t xml:space="preserve">Site search, product filter, galleries, videos and accordions work in all supported browsers (section 8).</w:t>
             </w:r>
           </w:p>
         </w:tc>
@@ -6088,6 +6130,83 @@
           </w:p>
         </w:tc>
       </w:tr>
+      <w:tr>
+        <w:tc>
+          <w:tcPr>
+            <w:tcW w:type="dxa" w:w="700"/>
+            <w:shd w:fill="FFFFFF" w:val="clear"/>
+            <w:tcMar>
+              <w:top w:type="dxa" w:w="60"/>
+              <w:left w:type="dxa" w:w="100"/>
+              <w:bottom w:type="dxa" w:w="60"/>
+              <w:right w:type="dxa" w:w="100"/>
+            </w:tcMar>
+          </w:tcPr>
+          <w:p>
+            <w:pPr>
+              <w:spacing w:after="20"/>
+            </w:pPr>
+            <w:r>
+              <w:rPr>
+                <w:rFonts w:ascii="Arial" w:cs="Arial" w:eastAsia="Arial" w:hAnsi="Arial"/>
+                <w:sz w:val="19"/>
+                <w:szCs w:val="19"/>
+              </w:rPr>
+              <w:t xml:space="preserve">B7</w:t>
+            </w:r>
+          </w:p>
+        </w:tc>
+        <w:tc>
+          <w:tcPr>
+            <w:tcW w:type="dxa" w:w="7126"/>
+            <w:shd w:fill="FFFFFF" w:val="clear"/>
+            <w:tcMar>
+              <w:top w:type="dxa" w:w="60"/>
+              <w:left w:type="dxa" w:w="100"/>
+              <w:bottom w:type="dxa" w:w="60"/>
+              <w:right w:type="dxa" w:w="100"/>
+            </w:tcMar>
+          </w:tcPr>
+          <w:p>
+            <w:pPr>
+              <w:spacing w:after="20"/>
+            </w:pPr>
+            <w:r>
+              <w:rPr>
+                <w:rFonts w:ascii="Arial" w:cs="Arial" w:eastAsia="Arial" w:hAnsi="Arial"/>
+                <w:sz w:val="19"/>
+                <w:szCs w:val="19"/>
+              </w:rPr>
+              <w:t xml:space="preserve">AI chat assistant (section 7): text-only traffic of a few KB per message – negligible for bandwidth; its usage cost is metered separately by the AI service (see C21).</w:t>
+            </w:r>
+          </w:p>
+        </w:tc>
+        <w:tc>
+          <w:tcPr>
+            <w:tcW w:type="dxa" w:w="1200"/>
+            <w:shd w:fill="FFFFFF" w:val="clear"/>
+            <w:tcMar>
+              <w:top w:type="dxa" w:w="60"/>
+              <w:left w:type="dxa" w:w="100"/>
+              <w:bottom w:type="dxa" w:w="60"/>
+              <w:right w:type="dxa" w:w="100"/>
+            </w:tcMar>
+          </w:tcPr>
+          <w:p>
+            <w:pPr>
+              <w:spacing w:after="20"/>
+            </w:pPr>
+            <w:r>
+              <w:rPr>
+                <w:rFonts w:ascii="Arial" w:cs="Arial" w:eastAsia="Arial" w:hAnsi="Arial"/>
+                <w:sz w:val="19"/>
+                <w:szCs w:val="19"/>
+              </w:rPr>
+              <w:t xml:space="preserve">MUST</w:t>
+            </w:r>
+          </w:p>
+        </w:tc>
+      </w:tr>
     </w:tbl>
     <w:p>
       <w:pPr>
@@ -8593,7 +8712,2537 @@
         <w:rPr>
           <w:rFonts w:ascii="Arial" w:cs="Arial" w:eastAsia="Arial" w:hAnsi="Arial"/>
         </w:rPr>
-        <w:t xml:space="preserve">7. Performance, accessibility and compatibility</w:t>
+        <w:t xml:space="preserve">7. AI chat assistant for visitors</w:t>
+      </w:r>
+    </w:p>
+    <w:p>
+      <w:pPr>
+        <w:spacing w:after="120" w:line="276"/>
+      </w:pPr>
+      <w:r>
+        <w:rPr>
+          <w:rFonts w:ascii="Arial" w:cs="Arial" w:eastAsia="Arial" w:hAnsi="Arial"/>
+          <w:sz w:val="21"/>
+          <w:szCs w:val="21"/>
+        </w:rPr>
+        <w:t xml:space="preserve">HYT plans to add an AI chat assistant that helps visitors find the right machine, service or contact in their own language, 24 hours a day. It must give reliable answers based only on HYT's approved information, hand complex or commercial questions to HYT staff, and meet the same security and privacy standards as the rest of the website.</w:t>
+      </w:r>
+    </w:p>
+    <w:p>
+      <w:pPr>
+        <w:pStyle w:val="Heading2"/>
+        <w:spacing w:after="120" w:before="240"/>
+      </w:pPr>
+      <w:r>
+        <w:rPr>
+          <w:rFonts w:ascii="Arial" w:cs="Arial" w:eastAsia="Arial" w:hAnsi="Arial"/>
+        </w:rPr>
+        <w:t xml:space="preserve">7.1 What the assistant must do</w:t>
+      </w:r>
+    </w:p>
+    <w:tbl>
+      <w:tblPr>
+        <w:tblW w:type="dxa" w:w="9026"/>
+        <w:tblBorders>
+          <w:top w:val="single" w:color="auto" w:sz="4"/>
+          <w:left w:val="single" w:color="auto" w:sz="4"/>
+          <w:bottom w:val="single" w:color="auto" w:sz="4"/>
+          <w:right w:val="single" w:color="auto" w:sz="4"/>
+          <w:insideH w:val="single" w:color="auto" w:sz="4"/>
+          <w:insideV w:val="single" w:color="auto" w:sz="4"/>
+        </w:tblBorders>
+      </w:tblPr>
+      <w:tblGrid>
+        <w:gridCol w:w="700"/>
+        <w:gridCol w:w="7126"/>
+        <w:gridCol w:w="1200"/>
+      </w:tblGrid>
+      <w:tr>
+        <w:trPr>
+          <w:tblHeader/>
+        </w:trPr>
+        <w:tc>
+          <w:tcPr>
+            <w:tcW w:type="dxa" w:w="700"/>
+            <w:shd w:fill="184A72" w:val="clear"/>
+            <w:tcMar>
+              <w:top w:type="dxa" w:w="60"/>
+              <w:left w:type="dxa" w:w="100"/>
+              <w:bottom w:type="dxa" w:w="60"/>
+              <w:right w:type="dxa" w:w="100"/>
+            </w:tcMar>
+          </w:tcPr>
+          <w:p>
+            <w:pPr>
+              <w:spacing w:after="20"/>
+            </w:pPr>
+            <w:r>
+              <w:rPr>
+                <w:rFonts w:ascii="Arial" w:cs="Arial" w:eastAsia="Arial" w:hAnsi="Arial"/>
+                <w:b/>
+                <w:bCs/>
+                <w:color w:val="FFFFFF"/>
+                <w:sz w:val="19"/>
+                <w:szCs w:val="19"/>
+              </w:rPr>
+              <w:t xml:space="preserve">#</w:t>
+            </w:r>
+          </w:p>
+        </w:tc>
+        <w:tc>
+          <w:tcPr>
+            <w:tcW w:type="dxa" w:w="7126"/>
+            <w:shd w:fill="184A72" w:val="clear"/>
+            <w:tcMar>
+              <w:top w:type="dxa" w:w="60"/>
+              <w:left w:type="dxa" w:w="100"/>
+              <w:bottom w:type="dxa" w:w="60"/>
+              <w:right w:type="dxa" w:w="100"/>
+            </w:tcMar>
+          </w:tcPr>
+          <w:p>
+            <w:pPr>
+              <w:spacing w:after="20"/>
+            </w:pPr>
+            <w:r>
+              <w:rPr>
+                <w:rFonts w:ascii="Arial" w:cs="Arial" w:eastAsia="Arial" w:hAnsi="Arial"/>
+                <w:b/>
+                <w:bCs/>
+                <w:color w:val="FFFFFF"/>
+                <w:sz w:val="19"/>
+                <w:szCs w:val="19"/>
+              </w:rPr>
+              <w:t xml:space="preserve">Requirement</w:t>
+            </w:r>
+          </w:p>
+        </w:tc>
+        <w:tc>
+          <w:tcPr>
+            <w:tcW w:type="dxa" w:w="1200"/>
+            <w:shd w:fill="184A72" w:val="clear"/>
+            <w:tcMar>
+              <w:top w:type="dxa" w:w="60"/>
+              <w:left w:type="dxa" w:w="100"/>
+              <w:bottom w:type="dxa" w:w="60"/>
+              <w:right w:type="dxa" w:w="100"/>
+            </w:tcMar>
+          </w:tcPr>
+          <w:p>
+            <w:pPr>
+              <w:spacing w:after="20"/>
+            </w:pPr>
+            <w:r>
+              <w:rPr>
+                <w:rFonts w:ascii="Arial" w:cs="Arial" w:eastAsia="Arial" w:hAnsi="Arial"/>
+                <w:b/>
+                <w:bCs/>
+                <w:color w:val="FFFFFF"/>
+                <w:sz w:val="19"/>
+                <w:szCs w:val="19"/>
+              </w:rPr>
+              <w:t xml:space="preserve">Priority</w:t>
+            </w:r>
+          </w:p>
+        </w:tc>
+      </w:tr>
+      <w:tr>
+        <w:tc>
+          <w:tcPr>
+            <w:tcW w:type="dxa" w:w="700"/>
+            <w:shd w:fill="FFFFFF" w:val="clear"/>
+            <w:tcMar>
+              <w:top w:type="dxa" w:w="60"/>
+              <w:left w:type="dxa" w:w="100"/>
+              <w:bottom w:type="dxa" w:w="60"/>
+              <w:right w:type="dxa" w:w="100"/>
+            </w:tcMar>
+          </w:tcPr>
+          <w:p>
+            <w:pPr>
+              <w:spacing w:after="20"/>
+            </w:pPr>
+            <w:r>
+              <w:rPr>
+                <w:rFonts w:ascii="Arial" w:cs="Arial" w:eastAsia="Arial" w:hAnsi="Arial"/>
+                <w:sz w:val="19"/>
+                <w:szCs w:val="19"/>
+              </w:rPr>
+              <w:t xml:space="preserve">C1</w:t>
+            </w:r>
+          </w:p>
+        </w:tc>
+        <w:tc>
+          <w:tcPr>
+            <w:tcW w:type="dxa" w:w="7126"/>
+            <w:shd w:fill="FFFFFF" w:val="clear"/>
+            <w:tcMar>
+              <w:top w:type="dxa" w:w="60"/>
+              <w:left w:type="dxa" w:w="100"/>
+              <w:bottom w:type="dxa" w:w="60"/>
+              <w:right w:type="dxa" w:w="100"/>
+            </w:tcMar>
+          </w:tcPr>
+          <w:p>
+            <w:pPr>
+              <w:spacing w:after="20"/>
+            </w:pPr>
+            <w:r>
+              <w:rPr>
+                <w:rFonts w:ascii="Arial" w:cs="Arial" w:eastAsia="Arial" w:hAnsi="Arial"/>
+                <w:sz w:val="19"/>
+                <w:szCs w:val="19"/>
+              </w:rPr>
+              <w:t xml:space="preserve">Answer visitor questions about HYT products, services, turnkey solutions, industries served, downloads, careers and contact details, with a link to the relevant website page in every answer.</w:t>
+            </w:r>
+          </w:p>
+        </w:tc>
+        <w:tc>
+          <w:tcPr>
+            <w:tcW w:type="dxa" w:w="1200"/>
+            <w:shd w:fill="FFFFFF" w:val="clear"/>
+            <w:tcMar>
+              <w:top w:type="dxa" w:w="60"/>
+              <w:left w:type="dxa" w:w="100"/>
+              <w:bottom w:type="dxa" w:w="60"/>
+              <w:right w:type="dxa" w:w="100"/>
+            </w:tcMar>
+          </w:tcPr>
+          <w:p>
+            <w:pPr>
+              <w:spacing w:after="20"/>
+            </w:pPr>
+            <w:r>
+              <w:rPr>
+                <w:rFonts w:ascii="Arial" w:cs="Arial" w:eastAsia="Arial" w:hAnsi="Arial"/>
+                <w:sz w:val="19"/>
+                <w:szCs w:val="19"/>
+              </w:rPr>
+              <w:t xml:space="preserve">MUST</w:t>
+            </w:r>
+          </w:p>
+        </w:tc>
+      </w:tr>
+      <w:tr>
+        <w:tc>
+          <w:tcPr>
+            <w:tcW w:type="dxa" w:w="700"/>
+            <w:shd w:fill="F6F8FA" w:val="clear"/>
+            <w:tcMar>
+              <w:top w:type="dxa" w:w="60"/>
+              <w:left w:type="dxa" w:w="100"/>
+              <w:bottom w:type="dxa" w:w="60"/>
+              <w:right w:type="dxa" w:w="100"/>
+            </w:tcMar>
+          </w:tcPr>
+          <w:p>
+            <w:pPr>
+              <w:spacing w:after="20"/>
+            </w:pPr>
+            <w:r>
+              <w:rPr>
+                <w:rFonts w:ascii="Arial" w:cs="Arial" w:eastAsia="Arial" w:hAnsi="Arial"/>
+                <w:sz w:val="19"/>
+                <w:szCs w:val="19"/>
+              </w:rPr>
+              <w:t xml:space="preserve">C2</w:t>
+            </w:r>
+          </w:p>
+        </w:tc>
+        <w:tc>
+          <w:tcPr>
+            <w:tcW w:type="dxa" w:w="7126"/>
+            <w:shd w:fill="F6F8FA" w:val="clear"/>
+            <w:tcMar>
+              <w:top w:type="dxa" w:w="60"/>
+              <w:left w:type="dxa" w:w="100"/>
+              <w:bottom w:type="dxa" w:w="60"/>
+              <w:right w:type="dxa" w:w="100"/>
+            </w:tcMar>
+          </w:tcPr>
+          <w:p>
+            <w:pPr>
+              <w:spacing w:after="20"/>
+            </w:pPr>
+            <w:r>
+              <w:rPr>
+                <w:rFonts w:ascii="Arial" w:cs="Arial" w:eastAsia="Arial" w:hAnsi="Arial"/>
+                <w:sz w:val="19"/>
+                <w:szCs w:val="19"/>
+              </w:rPr>
+              <w:t xml:space="preserve">Reply in the language of the page the visitor is on (English, German, French, Italian, Dutch; North American English on /en-us/), or in the language the visitor writes in.</w:t>
+            </w:r>
+          </w:p>
+        </w:tc>
+        <w:tc>
+          <w:tcPr>
+            <w:tcW w:type="dxa" w:w="1200"/>
+            <w:shd w:fill="F6F8FA" w:val="clear"/>
+            <w:tcMar>
+              <w:top w:type="dxa" w:w="60"/>
+              <w:left w:type="dxa" w:w="100"/>
+              <w:bottom w:type="dxa" w:w="60"/>
+              <w:right w:type="dxa" w:w="100"/>
+            </w:tcMar>
+          </w:tcPr>
+          <w:p>
+            <w:pPr>
+              <w:spacing w:after="20"/>
+            </w:pPr>
+            <w:r>
+              <w:rPr>
+                <w:rFonts w:ascii="Arial" w:cs="Arial" w:eastAsia="Arial" w:hAnsi="Arial"/>
+                <w:sz w:val="19"/>
+                <w:szCs w:val="19"/>
+              </w:rPr>
+              <w:t xml:space="preserve">MUST</w:t>
+            </w:r>
+          </w:p>
+        </w:tc>
+      </w:tr>
+      <w:tr>
+        <w:tc>
+          <w:tcPr>
+            <w:tcW w:type="dxa" w:w="700"/>
+            <w:shd w:fill="FFFFFF" w:val="clear"/>
+            <w:tcMar>
+              <w:top w:type="dxa" w:w="60"/>
+              <w:left w:type="dxa" w:w="100"/>
+              <w:bottom w:type="dxa" w:w="60"/>
+              <w:right w:type="dxa" w:w="100"/>
+            </w:tcMar>
+          </w:tcPr>
+          <w:p>
+            <w:pPr>
+              <w:spacing w:after="20"/>
+            </w:pPr>
+            <w:r>
+              <w:rPr>
+                <w:rFonts w:ascii="Arial" w:cs="Arial" w:eastAsia="Arial" w:hAnsi="Arial"/>
+                <w:sz w:val="19"/>
+                <w:szCs w:val="19"/>
+              </w:rPr>
+              <w:t xml:space="preserve">C3</w:t>
+            </w:r>
+          </w:p>
+        </w:tc>
+        <w:tc>
+          <w:tcPr>
+            <w:tcW w:type="dxa" w:w="7126"/>
+            <w:shd w:fill="FFFFFF" w:val="clear"/>
+            <w:tcMar>
+              <w:top w:type="dxa" w:w="60"/>
+              <w:left w:type="dxa" w:w="100"/>
+              <w:bottom w:type="dxa" w:w="60"/>
+              <w:right w:type="dxa" w:w="100"/>
+            </w:tcMar>
+          </w:tcPr>
+          <w:p>
+            <w:pPr>
+              <w:spacing w:after="20"/>
+            </w:pPr>
+            <w:r>
+              <w:rPr>
+                <w:rFonts w:ascii="Arial" w:cs="Arial" w:eastAsia="Arial" w:hAnsi="Arial"/>
+                <w:sz w:val="19"/>
+                <w:szCs w:val="19"/>
+              </w:rPr>
+              <w:t xml:space="preserve">Guide visitors to the right product (e.g. underfloor vs surface vs portal wheel lathe) by asking simple questions about their fleet and workshop, then link to the product page and catalogue.</w:t>
+            </w:r>
+          </w:p>
+        </w:tc>
+        <w:tc>
+          <w:tcPr>
+            <w:tcW w:type="dxa" w:w="1200"/>
+            <w:shd w:fill="FFFFFF" w:val="clear"/>
+            <w:tcMar>
+              <w:top w:type="dxa" w:w="60"/>
+              <w:left w:type="dxa" w:w="100"/>
+              <w:bottom w:type="dxa" w:w="60"/>
+              <w:right w:type="dxa" w:w="100"/>
+            </w:tcMar>
+          </w:tcPr>
+          <w:p>
+            <w:pPr>
+              <w:spacing w:after="20"/>
+            </w:pPr>
+            <w:r>
+              <w:rPr>
+                <w:rFonts w:ascii="Arial" w:cs="Arial" w:eastAsia="Arial" w:hAnsi="Arial"/>
+                <w:sz w:val="19"/>
+                <w:szCs w:val="19"/>
+              </w:rPr>
+              <w:t xml:space="preserve">SHOULD</w:t>
+            </w:r>
+          </w:p>
+        </w:tc>
+      </w:tr>
+      <w:tr>
+        <w:tc>
+          <w:tcPr>
+            <w:tcW w:type="dxa" w:w="700"/>
+            <w:shd w:fill="F6F8FA" w:val="clear"/>
+            <w:tcMar>
+              <w:top w:type="dxa" w:w="60"/>
+              <w:left w:type="dxa" w:w="100"/>
+              <w:bottom w:type="dxa" w:w="60"/>
+              <w:right w:type="dxa" w:w="100"/>
+            </w:tcMar>
+          </w:tcPr>
+          <w:p>
+            <w:pPr>
+              <w:spacing w:after="20"/>
+            </w:pPr>
+            <w:r>
+              <w:rPr>
+                <w:rFonts w:ascii="Arial" w:cs="Arial" w:eastAsia="Arial" w:hAnsi="Arial"/>
+                <w:sz w:val="19"/>
+                <w:szCs w:val="19"/>
+              </w:rPr>
+              <w:t xml:space="preserve">C4</w:t>
+            </w:r>
+          </w:p>
+        </w:tc>
+        <w:tc>
+          <w:tcPr>
+            <w:tcW w:type="dxa" w:w="7126"/>
+            <w:shd w:fill="F6F8FA" w:val="clear"/>
+            <w:tcMar>
+              <w:top w:type="dxa" w:w="60"/>
+              <w:left w:type="dxa" w:w="100"/>
+              <w:bottom w:type="dxa" w:w="60"/>
+              <w:right w:type="dxa" w:w="100"/>
+            </w:tcMar>
+          </w:tcPr>
+          <w:p>
+            <w:pPr>
+              <w:spacing w:after="20"/>
+            </w:pPr>
+            <w:r>
+              <w:rPr>
+                <w:rFonts w:ascii="Arial" w:cs="Arial" w:eastAsia="Arial" w:hAnsi="Arial"/>
+                <w:sz w:val="19"/>
+                <w:szCs w:val="19"/>
+              </w:rPr>
+              <w:t xml:space="preserve">Lead capture: with the visitor's consent, collect name, company, email, phone, country and requirement, and send it to digitalmkt@hytengineering.com (or HYT's CRM) with the chat transcript.</w:t>
+            </w:r>
+          </w:p>
+        </w:tc>
+        <w:tc>
+          <w:tcPr>
+            <w:tcW w:type="dxa" w:w="1200"/>
+            <w:shd w:fill="F6F8FA" w:val="clear"/>
+            <w:tcMar>
+              <w:top w:type="dxa" w:w="60"/>
+              <w:left w:type="dxa" w:w="100"/>
+              <w:bottom w:type="dxa" w:w="60"/>
+              <w:right w:type="dxa" w:w="100"/>
+            </w:tcMar>
+          </w:tcPr>
+          <w:p>
+            <w:pPr>
+              <w:spacing w:after="20"/>
+            </w:pPr>
+            <w:r>
+              <w:rPr>
+                <w:rFonts w:ascii="Arial" w:cs="Arial" w:eastAsia="Arial" w:hAnsi="Arial"/>
+                <w:sz w:val="19"/>
+                <w:szCs w:val="19"/>
+              </w:rPr>
+              <w:t xml:space="preserve">MUST</w:t>
+            </w:r>
+          </w:p>
+        </w:tc>
+      </w:tr>
+      <w:tr>
+        <w:tc>
+          <w:tcPr>
+            <w:tcW w:type="dxa" w:w="700"/>
+            <w:shd w:fill="FFFFFF" w:val="clear"/>
+            <w:tcMar>
+              <w:top w:type="dxa" w:w="60"/>
+              <w:left w:type="dxa" w:w="100"/>
+              <w:bottom w:type="dxa" w:w="60"/>
+              <w:right w:type="dxa" w:w="100"/>
+            </w:tcMar>
+          </w:tcPr>
+          <w:p>
+            <w:pPr>
+              <w:spacing w:after="20"/>
+            </w:pPr>
+            <w:r>
+              <w:rPr>
+                <w:rFonts w:ascii="Arial" w:cs="Arial" w:eastAsia="Arial" w:hAnsi="Arial"/>
+                <w:sz w:val="19"/>
+                <w:szCs w:val="19"/>
+              </w:rPr>
+              <w:t xml:space="preserve">C5</w:t>
+            </w:r>
+          </w:p>
+        </w:tc>
+        <w:tc>
+          <w:tcPr>
+            <w:tcW w:type="dxa" w:w="7126"/>
+            <w:shd w:fill="FFFFFF" w:val="clear"/>
+            <w:tcMar>
+              <w:top w:type="dxa" w:w="60"/>
+              <w:left w:type="dxa" w:w="100"/>
+              <w:bottom w:type="dxa" w:w="60"/>
+              <w:right w:type="dxa" w:w="100"/>
+            </w:tcMar>
+          </w:tcPr>
+          <w:p>
+            <w:pPr>
+              <w:spacing w:after="20"/>
+            </w:pPr>
+            <w:r>
+              <w:rPr>
+                <w:rFonts w:ascii="Arial" w:cs="Arial" w:eastAsia="Arial" w:hAnsi="Arial"/>
+                <w:sz w:val="19"/>
+                <w:szCs w:val="19"/>
+              </w:rPr>
+              <w:t xml:space="preserve">Hand-over to a human: offer "Talk to our team" at any time – enquiry form, email, phone (+91 20 6634 3900) and toll-free service line (1800 2100 456); during office hours, optional live hand-over to a staff member.</w:t>
+            </w:r>
+          </w:p>
+        </w:tc>
+        <w:tc>
+          <w:tcPr>
+            <w:tcW w:type="dxa" w:w="1200"/>
+            <w:shd w:fill="FFFFFF" w:val="clear"/>
+            <w:tcMar>
+              <w:top w:type="dxa" w:w="60"/>
+              <w:left w:type="dxa" w:w="100"/>
+              <w:bottom w:type="dxa" w:w="60"/>
+              <w:right w:type="dxa" w:w="100"/>
+            </w:tcMar>
+          </w:tcPr>
+          <w:p>
+            <w:pPr>
+              <w:spacing w:after="20"/>
+            </w:pPr>
+            <w:r>
+              <w:rPr>
+                <w:rFonts w:ascii="Arial" w:cs="Arial" w:eastAsia="Arial" w:hAnsi="Arial"/>
+                <w:sz w:val="19"/>
+                <w:szCs w:val="19"/>
+              </w:rPr>
+              <w:t xml:space="preserve">MUST</w:t>
+            </w:r>
+          </w:p>
+        </w:tc>
+      </w:tr>
+      <w:tr>
+        <w:tc>
+          <w:tcPr>
+            <w:tcW w:type="dxa" w:w="700"/>
+            <w:shd w:fill="F6F8FA" w:val="clear"/>
+            <w:tcMar>
+              <w:top w:type="dxa" w:w="60"/>
+              <w:left w:type="dxa" w:w="100"/>
+              <w:bottom w:type="dxa" w:w="60"/>
+              <w:right w:type="dxa" w:w="100"/>
+            </w:tcMar>
+          </w:tcPr>
+          <w:p>
+            <w:pPr>
+              <w:spacing w:after="20"/>
+            </w:pPr>
+            <w:r>
+              <w:rPr>
+                <w:rFonts w:ascii="Arial" w:cs="Arial" w:eastAsia="Arial" w:hAnsi="Arial"/>
+                <w:sz w:val="19"/>
+                <w:szCs w:val="19"/>
+              </w:rPr>
+              <w:t xml:space="preserve">C6</w:t>
+            </w:r>
+          </w:p>
+        </w:tc>
+        <w:tc>
+          <w:tcPr>
+            <w:tcW w:type="dxa" w:w="7126"/>
+            <w:shd w:fill="F6F8FA" w:val="clear"/>
+            <w:tcMar>
+              <w:top w:type="dxa" w:w="60"/>
+              <w:left w:type="dxa" w:w="100"/>
+              <w:bottom w:type="dxa" w:w="60"/>
+              <w:right w:type="dxa" w:w="100"/>
+            </w:tcMar>
+          </w:tcPr>
+          <w:p>
+            <w:pPr>
+              <w:spacing w:after="20"/>
+            </w:pPr>
+            <w:r>
+              <w:rPr>
+                <w:rFonts w:ascii="Arial" w:cs="Arial" w:eastAsia="Arial" w:hAnsi="Arial"/>
+                <w:sz w:val="19"/>
+                <w:szCs w:val="19"/>
+              </w:rPr>
+              <w:t xml:space="preserve">After-sales visitors are directed to the toll-free service line and the service network page; career questions to the Careers page and careers@hytengineering.com.</w:t>
+            </w:r>
+          </w:p>
+        </w:tc>
+        <w:tc>
+          <w:tcPr>
+            <w:tcW w:type="dxa" w:w="1200"/>
+            <w:shd w:fill="F6F8FA" w:val="clear"/>
+            <w:tcMar>
+              <w:top w:type="dxa" w:w="60"/>
+              <w:left w:type="dxa" w:w="100"/>
+              <w:bottom w:type="dxa" w:w="60"/>
+              <w:right w:type="dxa" w:w="100"/>
+            </w:tcMar>
+          </w:tcPr>
+          <w:p>
+            <w:pPr>
+              <w:spacing w:after="20"/>
+            </w:pPr>
+            <w:r>
+              <w:rPr>
+                <w:rFonts w:ascii="Arial" w:cs="Arial" w:eastAsia="Arial" w:hAnsi="Arial"/>
+                <w:sz w:val="19"/>
+                <w:szCs w:val="19"/>
+              </w:rPr>
+              <w:t xml:space="preserve">MUST</w:t>
+            </w:r>
+          </w:p>
+        </w:tc>
+      </w:tr>
+    </w:tbl>
+    <w:p>
+      <w:pPr>
+        <w:pStyle w:val="Heading2"/>
+        <w:spacing w:after="120" w:before="240"/>
+      </w:pPr>
+      <w:r>
+        <w:rPr>
+          <w:rFonts w:ascii="Arial" w:cs="Arial" w:eastAsia="Arial" w:hAnsi="Arial"/>
+        </w:rPr>
+        <w:t xml:space="preserve">7.2 Accuracy and content rules</w:t>
+      </w:r>
+    </w:p>
+    <w:tbl>
+      <w:tblPr>
+        <w:tblW w:type="dxa" w:w="9026"/>
+        <w:tblBorders>
+          <w:top w:val="single" w:color="auto" w:sz="4"/>
+          <w:left w:val="single" w:color="auto" w:sz="4"/>
+          <w:bottom w:val="single" w:color="auto" w:sz="4"/>
+          <w:right w:val="single" w:color="auto" w:sz="4"/>
+          <w:insideH w:val="single" w:color="auto" w:sz="4"/>
+          <w:insideV w:val="single" w:color="auto" w:sz="4"/>
+        </w:tblBorders>
+      </w:tblPr>
+      <w:tblGrid>
+        <w:gridCol w:w="700"/>
+        <w:gridCol w:w="7126"/>
+        <w:gridCol w:w="1200"/>
+      </w:tblGrid>
+      <w:tr>
+        <w:trPr>
+          <w:tblHeader/>
+        </w:trPr>
+        <w:tc>
+          <w:tcPr>
+            <w:tcW w:type="dxa" w:w="700"/>
+            <w:shd w:fill="184A72" w:val="clear"/>
+            <w:tcMar>
+              <w:top w:type="dxa" w:w="60"/>
+              <w:left w:type="dxa" w:w="100"/>
+              <w:bottom w:type="dxa" w:w="60"/>
+              <w:right w:type="dxa" w:w="100"/>
+            </w:tcMar>
+          </w:tcPr>
+          <w:p>
+            <w:pPr>
+              <w:spacing w:after="20"/>
+            </w:pPr>
+            <w:r>
+              <w:rPr>
+                <w:rFonts w:ascii="Arial" w:cs="Arial" w:eastAsia="Arial" w:hAnsi="Arial"/>
+                <w:b/>
+                <w:bCs/>
+                <w:color w:val="FFFFFF"/>
+                <w:sz w:val="19"/>
+                <w:szCs w:val="19"/>
+              </w:rPr>
+              <w:t xml:space="preserve">#</w:t>
+            </w:r>
+          </w:p>
+        </w:tc>
+        <w:tc>
+          <w:tcPr>
+            <w:tcW w:type="dxa" w:w="7126"/>
+            <w:shd w:fill="184A72" w:val="clear"/>
+            <w:tcMar>
+              <w:top w:type="dxa" w:w="60"/>
+              <w:left w:type="dxa" w:w="100"/>
+              <w:bottom w:type="dxa" w:w="60"/>
+              <w:right w:type="dxa" w:w="100"/>
+            </w:tcMar>
+          </w:tcPr>
+          <w:p>
+            <w:pPr>
+              <w:spacing w:after="20"/>
+            </w:pPr>
+            <w:r>
+              <w:rPr>
+                <w:rFonts w:ascii="Arial" w:cs="Arial" w:eastAsia="Arial" w:hAnsi="Arial"/>
+                <w:b/>
+                <w:bCs/>
+                <w:color w:val="FFFFFF"/>
+                <w:sz w:val="19"/>
+                <w:szCs w:val="19"/>
+              </w:rPr>
+              <w:t xml:space="preserve">Requirement</w:t>
+            </w:r>
+          </w:p>
+        </w:tc>
+        <w:tc>
+          <w:tcPr>
+            <w:tcW w:type="dxa" w:w="1200"/>
+            <w:shd w:fill="184A72" w:val="clear"/>
+            <w:tcMar>
+              <w:top w:type="dxa" w:w="60"/>
+              <w:left w:type="dxa" w:w="100"/>
+              <w:bottom w:type="dxa" w:w="60"/>
+              <w:right w:type="dxa" w:w="100"/>
+            </w:tcMar>
+          </w:tcPr>
+          <w:p>
+            <w:pPr>
+              <w:spacing w:after="20"/>
+            </w:pPr>
+            <w:r>
+              <w:rPr>
+                <w:rFonts w:ascii="Arial" w:cs="Arial" w:eastAsia="Arial" w:hAnsi="Arial"/>
+                <w:b/>
+                <w:bCs/>
+                <w:color w:val="FFFFFF"/>
+                <w:sz w:val="19"/>
+                <w:szCs w:val="19"/>
+              </w:rPr>
+              <w:t xml:space="preserve">Priority</w:t>
+            </w:r>
+          </w:p>
+        </w:tc>
+      </w:tr>
+      <w:tr>
+        <w:tc>
+          <w:tcPr>
+            <w:tcW w:type="dxa" w:w="700"/>
+            <w:shd w:fill="FFFFFF" w:val="clear"/>
+            <w:tcMar>
+              <w:top w:type="dxa" w:w="60"/>
+              <w:left w:type="dxa" w:w="100"/>
+              <w:bottom w:type="dxa" w:w="60"/>
+              <w:right w:type="dxa" w:w="100"/>
+            </w:tcMar>
+          </w:tcPr>
+          <w:p>
+            <w:pPr>
+              <w:spacing w:after="20"/>
+            </w:pPr>
+            <w:r>
+              <w:rPr>
+                <w:rFonts w:ascii="Arial" w:cs="Arial" w:eastAsia="Arial" w:hAnsi="Arial"/>
+                <w:sz w:val="19"/>
+                <w:szCs w:val="19"/>
+              </w:rPr>
+              <w:t xml:space="preserve">C7</w:t>
+            </w:r>
+          </w:p>
+        </w:tc>
+        <w:tc>
+          <w:tcPr>
+            <w:tcW w:type="dxa" w:w="7126"/>
+            <w:shd w:fill="FFFFFF" w:val="clear"/>
+            <w:tcMar>
+              <w:top w:type="dxa" w:w="60"/>
+              <w:left w:type="dxa" w:w="100"/>
+              <w:bottom w:type="dxa" w:w="60"/>
+              <w:right w:type="dxa" w:w="100"/>
+            </w:tcMar>
+          </w:tcPr>
+          <w:p>
+            <w:pPr>
+              <w:spacing w:after="20"/>
+            </w:pPr>
+            <w:r>
+              <w:rPr>
+                <w:rFonts w:ascii="Arial" w:cs="Arial" w:eastAsia="Arial" w:hAnsi="Arial"/>
+                <w:b/>
+                <w:bCs/>
+                <w:sz w:val="19"/>
+                <w:szCs w:val="19"/>
+              </w:rPr>
+              <w:t xml:space="preserve">Grounded answers only:</w:t>
+            </w:r>
+            <w:r>
+              <w:rPr>
+                <w:rFonts w:ascii="Arial" w:cs="Arial" w:eastAsia="Arial" w:hAnsi="Arial"/>
+                <w:sz w:val="19"/>
+                <w:szCs w:val="19"/>
+              </w:rPr>
+              <w:t xml:space="preserve"> the assistant answers from an approved knowledge base (the published website content in all languages and approved catalogues/datasheets). It must not use general internet knowledge for statements about HYT.</w:t>
+            </w:r>
+          </w:p>
+        </w:tc>
+        <w:tc>
+          <w:tcPr>
+            <w:tcW w:type="dxa" w:w="1200"/>
+            <w:shd w:fill="FFFFFF" w:val="clear"/>
+            <w:tcMar>
+              <w:top w:type="dxa" w:w="60"/>
+              <w:left w:type="dxa" w:w="100"/>
+              <w:bottom w:type="dxa" w:w="60"/>
+              <w:right w:type="dxa" w:w="100"/>
+            </w:tcMar>
+          </w:tcPr>
+          <w:p>
+            <w:pPr>
+              <w:spacing w:after="20"/>
+            </w:pPr>
+            <w:r>
+              <w:rPr>
+                <w:rFonts w:ascii="Arial" w:cs="Arial" w:eastAsia="Arial" w:hAnsi="Arial"/>
+                <w:sz w:val="19"/>
+                <w:szCs w:val="19"/>
+              </w:rPr>
+              <w:t xml:space="preserve">MUST</w:t>
+            </w:r>
+          </w:p>
+        </w:tc>
+      </w:tr>
+      <w:tr>
+        <w:tc>
+          <w:tcPr>
+            <w:tcW w:type="dxa" w:w="700"/>
+            <w:shd w:fill="F6F8FA" w:val="clear"/>
+            <w:tcMar>
+              <w:top w:type="dxa" w:w="60"/>
+              <w:left w:type="dxa" w:w="100"/>
+              <w:bottom w:type="dxa" w:w="60"/>
+              <w:right w:type="dxa" w:w="100"/>
+            </w:tcMar>
+          </w:tcPr>
+          <w:p>
+            <w:pPr>
+              <w:spacing w:after="20"/>
+            </w:pPr>
+            <w:r>
+              <w:rPr>
+                <w:rFonts w:ascii="Arial" w:cs="Arial" w:eastAsia="Arial" w:hAnsi="Arial"/>
+                <w:sz w:val="19"/>
+                <w:szCs w:val="19"/>
+              </w:rPr>
+              <w:t xml:space="preserve">C8</w:t>
+            </w:r>
+          </w:p>
+        </w:tc>
+        <w:tc>
+          <w:tcPr>
+            <w:tcW w:type="dxa" w:w="7126"/>
+            <w:shd w:fill="F6F8FA" w:val="clear"/>
+            <w:tcMar>
+              <w:top w:type="dxa" w:w="60"/>
+              <w:left w:type="dxa" w:w="100"/>
+              <w:bottom w:type="dxa" w:w="60"/>
+              <w:right w:type="dxa" w:w="100"/>
+            </w:tcMar>
+          </w:tcPr>
+          <w:p>
+            <w:pPr>
+              <w:spacing w:after="20"/>
+            </w:pPr>
+            <w:r>
+              <w:rPr>
+                <w:rFonts w:ascii="Arial" w:cs="Arial" w:eastAsia="Arial" w:hAnsi="Arial"/>
+                <w:b/>
+                <w:bCs/>
+                <w:sz w:val="19"/>
+                <w:szCs w:val="19"/>
+              </w:rPr>
+              <w:t xml:space="preserve">Never invent</w:t>
+            </w:r>
+            <w:r>
+              <w:rPr>
+                <w:rFonts w:ascii="Arial" w:cs="Arial" w:eastAsia="Arial" w:hAnsi="Arial"/>
+                <w:sz w:val="19"/>
+                <w:szCs w:val="19"/>
+              </w:rPr>
+              <w:t xml:space="preserve"> technical specifications, prices, delivery times, warranties, customer names or project details. Values shown as "On request" on the website must be answered as "on request – our engineers will confirm".</w:t>
+            </w:r>
+          </w:p>
+        </w:tc>
+        <w:tc>
+          <w:tcPr>
+            <w:tcW w:type="dxa" w:w="1200"/>
+            <w:shd w:fill="F6F8FA" w:val="clear"/>
+            <w:tcMar>
+              <w:top w:type="dxa" w:w="60"/>
+              <w:left w:type="dxa" w:w="100"/>
+              <w:bottom w:type="dxa" w:w="60"/>
+              <w:right w:type="dxa" w:w="100"/>
+            </w:tcMar>
+          </w:tcPr>
+          <w:p>
+            <w:pPr>
+              <w:spacing w:after="20"/>
+            </w:pPr>
+            <w:r>
+              <w:rPr>
+                <w:rFonts w:ascii="Arial" w:cs="Arial" w:eastAsia="Arial" w:hAnsi="Arial"/>
+                <w:sz w:val="19"/>
+                <w:szCs w:val="19"/>
+              </w:rPr>
+              <w:t xml:space="preserve">MUST</w:t>
+            </w:r>
+          </w:p>
+        </w:tc>
+      </w:tr>
+      <w:tr>
+        <w:tc>
+          <w:tcPr>
+            <w:tcW w:type="dxa" w:w="700"/>
+            <w:shd w:fill="FFFFFF" w:val="clear"/>
+            <w:tcMar>
+              <w:top w:type="dxa" w:w="60"/>
+              <w:left w:type="dxa" w:w="100"/>
+              <w:bottom w:type="dxa" w:w="60"/>
+              <w:right w:type="dxa" w:w="100"/>
+            </w:tcMar>
+          </w:tcPr>
+          <w:p>
+            <w:pPr>
+              <w:spacing w:after="20"/>
+            </w:pPr>
+            <w:r>
+              <w:rPr>
+                <w:rFonts w:ascii="Arial" w:cs="Arial" w:eastAsia="Arial" w:hAnsi="Arial"/>
+                <w:sz w:val="19"/>
+                <w:szCs w:val="19"/>
+              </w:rPr>
+              <w:t xml:space="preserve">C9</w:t>
+            </w:r>
+          </w:p>
+        </w:tc>
+        <w:tc>
+          <w:tcPr>
+            <w:tcW w:type="dxa" w:w="7126"/>
+            <w:shd w:fill="FFFFFF" w:val="clear"/>
+            <w:tcMar>
+              <w:top w:type="dxa" w:w="60"/>
+              <w:left w:type="dxa" w:w="100"/>
+              <w:bottom w:type="dxa" w:w="60"/>
+              <w:right w:type="dxa" w:w="100"/>
+            </w:tcMar>
+          </w:tcPr>
+          <w:p>
+            <w:pPr>
+              <w:spacing w:after="20"/>
+            </w:pPr>
+            <w:r>
+              <w:rPr>
+                <w:rFonts w:ascii="Arial" w:cs="Arial" w:eastAsia="Arial" w:hAnsi="Arial"/>
+                <w:sz w:val="19"/>
+                <w:szCs w:val="19"/>
+              </w:rPr>
+              <w:t xml:space="preserve">No commercial commitments: quotations, prices, discounts, delivery dates, tender questions and contract terms are always handed to the sales team.</w:t>
+            </w:r>
+          </w:p>
+        </w:tc>
+        <w:tc>
+          <w:tcPr>
+            <w:tcW w:type="dxa" w:w="1200"/>
+            <w:shd w:fill="FFFFFF" w:val="clear"/>
+            <w:tcMar>
+              <w:top w:type="dxa" w:w="60"/>
+              <w:left w:type="dxa" w:w="100"/>
+              <w:bottom w:type="dxa" w:w="60"/>
+              <w:right w:type="dxa" w:w="100"/>
+            </w:tcMar>
+          </w:tcPr>
+          <w:p>
+            <w:pPr>
+              <w:spacing w:after="20"/>
+            </w:pPr>
+            <w:r>
+              <w:rPr>
+                <w:rFonts w:ascii="Arial" w:cs="Arial" w:eastAsia="Arial" w:hAnsi="Arial"/>
+                <w:sz w:val="19"/>
+                <w:szCs w:val="19"/>
+              </w:rPr>
+              <w:t xml:space="preserve">MUST</w:t>
+            </w:r>
+          </w:p>
+        </w:tc>
+      </w:tr>
+      <w:tr>
+        <w:tc>
+          <w:tcPr>
+            <w:tcW w:type="dxa" w:w="700"/>
+            <w:shd w:fill="F6F8FA" w:val="clear"/>
+            <w:tcMar>
+              <w:top w:type="dxa" w:w="60"/>
+              <w:left w:type="dxa" w:w="100"/>
+              <w:bottom w:type="dxa" w:w="60"/>
+              <w:right w:type="dxa" w:w="100"/>
+            </w:tcMar>
+          </w:tcPr>
+          <w:p>
+            <w:pPr>
+              <w:spacing w:after="20"/>
+            </w:pPr>
+            <w:r>
+              <w:rPr>
+                <w:rFonts w:ascii="Arial" w:cs="Arial" w:eastAsia="Arial" w:hAnsi="Arial"/>
+                <w:sz w:val="19"/>
+                <w:szCs w:val="19"/>
+              </w:rPr>
+              <w:t xml:space="preserve">C10</w:t>
+            </w:r>
+          </w:p>
+        </w:tc>
+        <w:tc>
+          <w:tcPr>
+            <w:tcW w:type="dxa" w:w="7126"/>
+            <w:shd w:fill="F6F8FA" w:val="clear"/>
+            <w:tcMar>
+              <w:top w:type="dxa" w:w="60"/>
+              <w:left w:type="dxa" w:w="100"/>
+              <w:bottom w:type="dxa" w:w="60"/>
+              <w:right w:type="dxa" w:w="100"/>
+            </w:tcMar>
+          </w:tcPr>
+          <w:p>
+            <w:pPr>
+              <w:spacing w:after="20"/>
+            </w:pPr>
+            <w:r>
+              <w:rPr>
+                <w:rFonts w:ascii="Arial" w:cs="Arial" w:eastAsia="Arial" w:hAnsi="Arial"/>
+                <w:sz w:val="19"/>
+                <w:szCs w:val="19"/>
+              </w:rPr>
+              <w:t xml:space="preserve">No answers on competitors, legal advice, or topics unrelated to HYT; polite refusal with a link to contact HYT.</w:t>
+            </w:r>
+          </w:p>
+        </w:tc>
+        <w:tc>
+          <w:tcPr>
+            <w:tcW w:type="dxa" w:w="1200"/>
+            <w:shd w:fill="F6F8FA" w:val="clear"/>
+            <w:tcMar>
+              <w:top w:type="dxa" w:w="60"/>
+              <w:left w:type="dxa" w:w="100"/>
+              <w:bottom w:type="dxa" w:w="60"/>
+              <w:right w:type="dxa" w:w="100"/>
+            </w:tcMar>
+          </w:tcPr>
+          <w:p>
+            <w:pPr>
+              <w:spacing w:after="20"/>
+            </w:pPr>
+            <w:r>
+              <w:rPr>
+                <w:rFonts w:ascii="Arial" w:cs="Arial" w:eastAsia="Arial" w:hAnsi="Arial"/>
+                <w:sz w:val="19"/>
+                <w:szCs w:val="19"/>
+              </w:rPr>
+              <w:t xml:space="preserve">MUST</w:t>
+            </w:r>
+          </w:p>
+        </w:tc>
+      </w:tr>
+      <w:tr>
+        <w:tc>
+          <w:tcPr>
+            <w:tcW w:type="dxa" w:w="700"/>
+            <w:shd w:fill="FFFFFF" w:val="clear"/>
+            <w:tcMar>
+              <w:top w:type="dxa" w:w="60"/>
+              <w:left w:type="dxa" w:w="100"/>
+              <w:bottom w:type="dxa" w:w="60"/>
+              <w:right w:type="dxa" w:w="100"/>
+            </w:tcMar>
+          </w:tcPr>
+          <w:p>
+            <w:pPr>
+              <w:spacing w:after="20"/>
+            </w:pPr>
+            <w:r>
+              <w:rPr>
+                <w:rFonts w:ascii="Arial" w:cs="Arial" w:eastAsia="Arial" w:hAnsi="Arial"/>
+                <w:sz w:val="19"/>
+                <w:szCs w:val="19"/>
+              </w:rPr>
+              <w:t xml:space="preserve">C11</w:t>
+            </w:r>
+          </w:p>
+        </w:tc>
+        <w:tc>
+          <w:tcPr>
+            <w:tcW w:type="dxa" w:w="7126"/>
+            <w:shd w:fill="FFFFFF" w:val="clear"/>
+            <w:tcMar>
+              <w:top w:type="dxa" w:w="60"/>
+              <w:left w:type="dxa" w:w="100"/>
+              <w:bottom w:type="dxa" w:w="60"/>
+              <w:right w:type="dxa" w:w="100"/>
+            </w:tcMar>
+          </w:tcPr>
+          <w:p>
+            <w:pPr>
+              <w:spacing w:after="20"/>
+            </w:pPr>
+            <w:r>
+              <w:rPr>
+                <w:rFonts w:ascii="Arial" w:cs="Arial" w:eastAsia="Arial" w:hAnsi="Arial"/>
+                <w:sz w:val="19"/>
+                <w:szCs w:val="19"/>
+              </w:rPr>
+              <w:t xml:space="preserve">When unsure, the assistant says so and offers the hand-over (C5) instead of guessing.</w:t>
+            </w:r>
+          </w:p>
+        </w:tc>
+        <w:tc>
+          <w:tcPr>
+            <w:tcW w:type="dxa" w:w="1200"/>
+            <w:shd w:fill="FFFFFF" w:val="clear"/>
+            <w:tcMar>
+              <w:top w:type="dxa" w:w="60"/>
+              <w:left w:type="dxa" w:w="100"/>
+              <w:bottom w:type="dxa" w:w="60"/>
+              <w:right w:type="dxa" w:w="100"/>
+            </w:tcMar>
+          </w:tcPr>
+          <w:p>
+            <w:pPr>
+              <w:spacing w:after="20"/>
+            </w:pPr>
+            <w:r>
+              <w:rPr>
+                <w:rFonts w:ascii="Arial" w:cs="Arial" w:eastAsia="Arial" w:hAnsi="Arial"/>
+                <w:sz w:val="19"/>
+                <w:szCs w:val="19"/>
+              </w:rPr>
+              <w:t xml:space="preserve">MUST</w:t>
+            </w:r>
+          </w:p>
+        </w:tc>
+      </w:tr>
+      <w:tr>
+        <w:tc>
+          <w:tcPr>
+            <w:tcW w:type="dxa" w:w="700"/>
+            <w:shd w:fill="F6F8FA" w:val="clear"/>
+            <w:tcMar>
+              <w:top w:type="dxa" w:w="60"/>
+              <w:left w:type="dxa" w:w="100"/>
+              <w:bottom w:type="dxa" w:w="60"/>
+              <w:right w:type="dxa" w:w="100"/>
+            </w:tcMar>
+          </w:tcPr>
+          <w:p>
+            <w:pPr>
+              <w:spacing w:after="20"/>
+            </w:pPr>
+            <w:r>
+              <w:rPr>
+                <w:rFonts w:ascii="Arial" w:cs="Arial" w:eastAsia="Arial" w:hAnsi="Arial"/>
+                <w:sz w:val="19"/>
+                <w:szCs w:val="19"/>
+              </w:rPr>
+              <w:t xml:space="preserve">C12</w:t>
+            </w:r>
+          </w:p>
+        </w:tc>
+        <w:tc>
+          <w:tcPr>
+            <w:tcW w:type="dxa" w:w="7126"/>
+            <w:shd w:fill="F6F8FA" w:val="clear"/>
+            <w:tcMar>
+              <w:top w:type="dxa" w:w="60"/>
+              <w:left w:type="dxa" w:w="100"/>
+              <w:bottom w:type="dxa" w:w="60"/>
+              <w:right w:type="dxa" w:w="100"/>
+            </w:tcMar>
+          </w:tcPr>
+          <w:p>
+            <w:pPr>
+              <w:spacing w:after="20"/>
+            </w:pPr>
+            <w:r>
+              <w:rPr>
+                <w:rFonts w:ascii="Arial" w:cs="Arial" w:eastAsia="Arial" w:hAnsi="Arial"/>
+                <w:sz w:val="19"/>
+                <w:szCs w:val="19"/>
+              </w:rPr>
+              <w:t xml:space="preserve">Knowledge base updates automatically when the website is rebuilt or redeployed (re-index within 24 hours); content marked "pending HYT approval" is excluded until approved.</w:t>
+            </w:r>
+          </w:p>
+        </w:tc>
+        <w:tc>
+          <w:tcPr>
+            <w:tcW w:type="dxa" w:w="1200"/>
+            <w:shd w:fill="F6F8FA" w:val="clear"/>
+            <w:tcMar>
+              <w:top w:type="dxa" w:w="60"/>
+              <w:left w:type="dxa" w:w="100"/>
+              <w:bottom w:type="dxa" w:w="60"/>
+              <w:right w:type="dxa" w:w="100"/>
+            </w:tcMar>
+          </w:tcPr>
+          <w:p>
+            <w:pPr>
+              <w:spacing w:after="20"/>
+            </w:pPr>
+            <w:r>
+              <w:rPr>
+                <w:rFonts w:ascii="Arial" w:cs="Arial" w:eastAsia="Arial" w:hAnsi="Arial"/>
+                <w:sz w:val="19"/>
+                <w:szCs w:val="19"/>
+              </w:rPr>
+              <w:t xml:space="preserve">MUST</w:t>
+            </w:r>
+          </w:p>
+        </w:tc>
+      </w:tr>
+      <w:tr>
+        <w:tc>
+          <w:tcPr>
+            <w:tcW w:type="dxa" w:w="700"/>
+            <w:shd w:fill="FFFFFF" w:val="clear"/>
+            <w:tcMar>
+              <w:top w:type="dxa" w:w="60"/>
+              <w:left w:type="dxa" w:w="100"/>
+              <w:bottom w:type="dxa" w:w="60"/>
+              <w:right w:type="dxa" w:w="100"/>
+            </w:tcMar>
+          </w:tcPr>
+          <w:p>
+            <w:pPr>
+              <w:spacing w:after="20"/>
+            </w:pPr>
+            <w:r>
+              <w:rPr>
+                <w:rFonts w:ascii="Arial" w:cs="Arial" w:eastAsia="Arial" w:hAnsi="Arial"/>
+                <w:sz w:val="19"/>
+                <w:szCs w:val="19"/>
+              </w:rPr>
+              <w:t xml:space="preserve">C13</w:t>
+            </w:r>
+          </w:p>
+        </w:tc>
+        <w:tc>
+          <w:tcPr>
+            <w:tcW w:type="dxa" w:w="7126"/>
+            <w:shd w:fill="FFFFFF" w:val="clear"/>
+            <w:tcMar>
+              <w:top w:type="dxa" w:w="60"/>
+              <w:left w:type="dxa" w:w="100"/>
+              <w:bottom w:type="dxa" w:w="60"/>
+              <w:right w:type="dxa" w:w="100"/>
+            </w:tcMar>
+          </w:tcPr>
+          <w:p>
+            <w:pPr>
+              <w:spacing w:after="20"/>
+            </w:pPr>
+            <w:r>
+              <w:rPr>
+                <w:rFonts w:ascii="Arial" w:cs="Arial" w:eastAsia="Arial" w:hAnsi="Arial"/>
+                <w:sz w:val="19"/>
+                <w:szCs w:val="19"/>
+              </w:rPr>
+              <w:t xml:space="preserve">Clear disclosure in the chat window: "AI assistant – answers may contain errors; please confirm technical and commercial details with HYT."</w:t>
+            </w:r>
+          </w:p>
+        </w:tc>
+        <w:tc>
+          <w:tcPr>
+            <w:tcW w:type="dxa" w:w="1200"/>
+            <w:shd w:fill="FFFFFF" w:val="clear"/>
+            <w:tcMar>
+              <w:top w:type="dxa" w:w="60"/>
+              <w:left w:type="dxa" w:w="100"/>
+              <w:bottom w:type="dxa" w:w="60"/>
+              <w:right w:type="dxa" w:w="100"/>
+            </w:tcMar>
+          </w:tcPr>
+          <w:p>
+            <w:pPr>
+              <w:spacing w:after="20"/>
+            </w:pPr>
+            <w:r>
+              <w:rPr>
+                <w:rFonts w:ascii="Arial" w:cs="Arial" w:eastAsia="Arial" w:hAnsi="Arial"/>
+                <w:sz w:val="19"/>
+                <w:szCs w:val="19"/>
+              </w:rPr>
+              <w:t xml:space="preserve">MUST</w:t>
+            </w:r>
+          </w:p>
+        </w:tc>
+      </w:tr>
+    </w:tbl>
+    <w:p>
+      <w:pPr>
+        <w:pStyle w:val="Heading2"/>
+        <w:spacing w:after="120" w:before="240"/>
+      </w:pPr>
+      <w:r>
+        <w:rPr>
+          <w:rFonts w:ascii="Arial" w:cs="Arial" w:eastAsia="Arial" w:hAnsi="Arial"/>
+        </w:rPr>
+        <w:t xml:space="preserve">7.3 User interface and performance</w:t>
+      </w:r>
+    </w:p>
+    <w:tbl>
+      <w:tblPr>
+        <w:tblW w:type="dxa" w:w="9026"/>
+        <w:tblBorders>
+          <w:top w:val="single" w:color="auto" w:sz="4"/>
+          <w:left w:val="single" w:color="auto" w:sz="4"/>
+          <w:bottom w:val="single" w:color="auto" w:sz="4"/>
+          <w:right w:val="single" w:color="auto" w:sz="4"/>
+          <w:insideH w:val="single" w:color="auto" w:sz="4"/>
+          <w:insideV w:val="single" w:color="auto" w:sz="4"/>
+        </w:tblBorders>
+      </w:tblPr>
+      <w:tblGrid>
+        <w:gridCol w:w="700"/>
+        <w:gridCol w:w="7126"/>
+        <w:gridCol w:w="1200"/>
+      </w:tblGrid>
+      <w:tr>
+        <w:trPr>
+          <w:tblHeader/>
+        </w:trPr>
+        <w:tc>
+          <w:tcPr>
+            <w:tcW w:type="dxa" w:w="700"/>
+            <w:shd w:fill="184A72" w:val="clear"/>
+            <w:tcMar>
+              <w:top w:type="dxa" w:w="60"/>
+              <w:left w:type="dxa" w:w="100"/>
+              <w:bottom w:type="dxa" w:w="60"/>
+              <w:right w:type="dxa" w:w="100"/>
+            </w:tcMar>
+          </w:tcPr>
+          <w:p>
+            <w:pPr>
+              <w:spacing w:after="20"/>
+            </w:pPr>
+            <w:r>
+              <w:rPr>
+                <w:rFonts w:ascii="Arial" w:cs="Arial" w:eastAsia="Arial" w:hAnsi="Arial"/>
+                <w:b/>
+                <w:bCs/>
+                <w:color w:val="FFFFFF"/>
+                <w:sz w:val="19"/>
+                <w:szCs w:val="19"/>
+              </w:rPr>
+              <w:t xml:space="preserve">#</w:t>
+            </w:r>
+          </w:p>
+        </w:tc>
+        <w:tc>
+          <w:tcPr>
+            <w:tcW w:type="dxa" w:w="7126"/>
+            <w:shd w:fill="184A72" w:val="clear"/>
+            <w:tcMar>
+              <w:top w:type="dxa" w:w="60"/>
+              <w:left w:type="dxa" w:w="100"/>
+              <w:bottom w:type="dxa" w:w="60"/>
+              <w:right w:type="dxa" w:w="100"/>
+            </w:tcMar>
+          </w:tcPr>
+          <w:p>
+            <w:pPr>
+              <w:spacing w:after="20"/>
+            </w:pPr>
+            <w:r>
+              <w:rPr>
+                <w:rFonts w:ascii="Arial" w:cs="Arial" w:eastAsia="Arial" w:hAnsi="Arial"/>
+                <w:b/>
+                <w:bCs/>
+                <w:color w:val="FFFFFF"/>
+                <w:sz w:val="19"/>
+                <w:szCs w:val="19"/>
+              </w:rPr>
+              <w:t xml:space="preserve">Requirement</w:t>
+            </w:r>
+          </w:p>
+        </w:tc>
+        <w:tc>
+          <w:tcPr>
+            <w:tcW w:type="dxa" w:w="1200"/>
+            <w:shd w:fill="184A72" w:val="clear"/>
+            <w:tcMar>
+              <w:top w:type="dxa" w:w="60"/>
+              <w:left w:type="dxa" w:w="100"/>
+              <w:bottom w:type="dxa" w:w="60"/>
+              <w:right w:type="dxa" w:w="100"/>
+            </w:tcMar>
+          </w:tcPr>
+          <w:p>
+            <w:pPr>
+              <w:spacing w:after="20"/>
+            </w:pPr>
+            <w:r>
+              <w:rPr>
+                <w:rFonts w:ascii="Arial" w:cs="Arial" w:eastAsia="Arial" w:hAnsi="Arial"/>
+                <w:b/>
+                <w:bCs/>
+                <w:color w:val="FFFFFF"/>
+                <w:sz w:val="19"/>
+                <w:szCs w:val="19"/>
+              </w:rPr>
+              <w:t xml:space="preserve">Priority</w:t>
+            </w:r>
+          </w:p>
+        </w:tc>
+      </w:tr>
+      <w:tr>
+        <w:tc>
+          <w:tcPr>
+            <w:tcW w:type="dxa" w:w="700"/>
+            <w:shd w:fill="FFFFFF" w:val="clear"/>
+            <w:tcMar>
+              <w:top w:type="dxa" w:w="60"/>
+              <w:left w:type="dxa" w:w="100"/>
+              <w:bottom w:type="dxa" w:w="60"/>
+              <w:right w:type="dxa" w:w="100"/>
+            </w:tcMar>
+          </w:tcPr>
+          <w:p>
+            <w:pPr>
+              <w:spacing w:after="20"/>
+            </w:pPr>
+            <w:r>
+              <w:rPr>
+                <w:rFonts w:ascii="Arial" w:cs="Arial" w:eastAsia="Arial" w:hAnsi="Arial"/>
+                <w:sz w:val="19"/>
+                <w:szCs w:val="19"/>
+              </w:rPr>
+              <w:t xml:space="preserve">C14</w:t>
+            </w:r>
+          </w:p>
+        </w:tc>
+        <w:tc>
+          <w:tcPr>
+            <w:tcW w:type="dxa" w:w="7126"/>
+            <w:shd w:fill="FFFFFF" w:val="clear"/>
+            <w:tcMar>
+              <w:top w:type="dxa" w:w="60"/>
+              <w:left w:type="dxa" w:w="100"/>
+              <w:bottom w:type="dxa" w:w="60"/>
+              <w:right w:type="dxa" w:w="100"/>
+            </w:tcMar>
+          </w:tcPr>
+          <w:p>
+            <w:pPr>
+              <w:spacing w:after="20"/>
+            </w:pPr>
+            <w:r>
+              <w:rPr>
+                <w:rFonts w:ascii="Arial" w:cs="Arial" w:eastAsia="Arial" w:hAnsi="Arial"/>
+                <w:sz w:val="19"/>
+                <w:szCs w:val="19"/>
+              </w:rPr>
+              <w:t xml:space="preserve">Chat button bottom-right on every page, in HYT colours, not overlapping the existing back-to-top button, the mobile menu or any future cookie banner; no automatic pop-up that covers content (one subtle prompt after 30 seconds MAY be used).</w:t>
+            </w:r>
+          </w:p>
+        </w:tc>
+        <w:tc>
+          <w:tcPr>
+            <w:tcW w:type="dxa" w:w="1200"/>
+            <w:shd w:fill="FFFFFF" w:val="clear"/>
+            <w:tcMar>
+              <w:top w:type="dxa" w:w="60"/>
+              <w:left w:type="dxa" w:w="100"/>
+              <w:bottom w:type="dxa" w:w="60"/>
+              <w:right w:type="dxa" w:w="100"/>
+            </w:tcMar>
+          </w:tcPr>
+          <w:p>
+            <w:pPr>
+              <w:spacing w:after="20"/>
+            </w:pPr>
+            <w:r>
+              <w:rPr>
+                <w:rFonts w:ascii="Arial" w:cs="Arial" w:eastAsia="Arial" w:hAnsi="Arial"/>
+                <w:sz w:val="19"/>
+                <w:szCs w:val="19"/>
+              </w:rPr>
+              <w:t xml:space="preserve">MUST</w:t>
+            </w:r>
+          </w:p>
+        </w:tc>
+      </w:tr>
+      <w:tr>
+        <w:tc>
+          <w:tcPr>
+            <w:tcW w:type="dxa" w:w="700"/>
+            <w:shd w:fill="F6F8FA" w:val="clear"/>
+            <w:tcMar>
+              <w:top w:type="dxa" w:w="60"/>
+              <w:left w:type="dxa" w:w="100"/>
+              <w:bottom w:type="dxa" w:w="60"/>
+              <w:right w:type="dxa" w:w="100"/>
+            </w:tcMar>
+          </w:tcPr>
+          <w:p>
+            <w:pPr>
+              <w:spacing w:after="20"/>
+            </w:pPr>
+            <w:r>
+              <w:rPr>
+                <w:rFonts w:ascii="Arial" w:cs="Arial" w:eastAsia="Arial" w:hAnsi="Arial"/>
+                <w:sz w:val="19"/>
+                <w:szCs w:val="19"/>
+              </w:rPr>
+              <w:t xml:space="preserve">C15</w:t>
+            </w:r>
+          </w:p>
+        </w:tc>
+        <w:tc>
+          <w:tcPr>
+            <w:tcW w:type="dxa" w:w="7126"/>
+            <w:shd w:fill="F6F8FA" w:val="clear"/>
+            <w:tcMar>
+              <w:top w:type="dxa" w:w="60"/>
+              <w:left w:type="dxa" w:w="100"/>
+              <w:bottom w:type="dxa" w:w="60"/>
+              <w:right w:type="dxa" w:w="100"/>
+            </w:tcMar>
+          </w:tcPr>
+          <w:p>
+            <w:pPr>
+              <w:spacing w:after="20"/>
+            </w:pPr>
+            <w:r>
+              <w:rPr>
+                <w:rFonts w:ascii="Arial" w:cs="Arial" w:eastAsia="Arial" w:hAnsi="Arial"/>
+                <w:sz w:val="19"/>
+                <w:szCs w:val="19"/>
+              </w:rPr>
+              <w:t xml:space="preserve">Accessible to WCAG 2.1 AA: keyboard operation, focus management, screen-reader labels and live-region announcements, sufficient contrast, works at 200 % zoom and on 360 px phones.</w:t>
+            </w:r>
+          </w:p>
+        </w:tc>
+        <w:tc>
+          <w:tcPr>
+            <w:tcW w:type="dxa" w:w="1200"/>
+            <w:shd w:fill="F6F8FA" w:val="clear"/>
+            <w:tcMar>
+              <w:top w:type="dxa" w:w="60"/>
+              <w:left w:type="dxa" w:w="100"/>
+              <w:bottom w:type="dxa" w:w="60"/>
+              <w:right w:type="dxa" w:w="100"/>
+            </w:tcMar>
+          </w:tcPr>
+          <w:p>
+            <w:pPr>
+              <w:spacing w:after="20"/>
+            </w:pPr>
+            <w:r>
+              <w:rPr>
+                <w:rFonts w:ascii="Arial" w:cs="Arial" w:eastAsia="Arial" w:hAnsi="Arial"/>
+                <w:sz w:val="19"/>
+                <w:szCs w:val="19"/>
+              </w:rPr>
+              <w:t xml:space="preserve">MUST</w:t>
+            </w:r>
+          </w:p>
+        </w:tc>
+      </w:tr>
+      <w:tr>
+        <w:tc>
+          <w:tcPr>
+            <w:tcW w:type="dxa" w:w="700"/>
+            <w:shd w:fill="FFFFFF" w:val="clear"/>
+            <w:tcMar>
+              <w:top w:type="dxa" w:w="60"/>
+              <w:left w:type="dxa" w:w="100"/>
+              <w:bottom w:type="dxa" w:w="60"/>
+              <w:right w:type="dxa" w:w="100"/>
+            </w:tcMar>
+          </w:tcPr>
+          <w:p>
+            <w:pPr>
+              <w:spacing w:after="20"/>
+            </w:pPr>
+            <w:r>
+              <w:rPr>
+                <w:rFonts w:ascii="Arial" w:cs="Arial" w:eastAsia="Arial" w:hAnsi="Arial"/>
+                <w:sz w:val="19"/>
+                <w:szCs w:val="19"/>
+              </w:rPr>
+              <w:t xml:space="preserve">C16</w:t>
+            </w:r>
+          </w:p>
+        </w:tc>
+        <w:tc>
+          <w:tcPr>
+            <w:tcW w:type="dxa" w:w="7126"/>
+            <w:shd w:fill="FFFFFF" w:val="clear"/>
+            <w:tcMar>
+              <w:top w:type="dxa" w:w="60"/>
+              <w:left w:type="dxa" w:w="100"/>
+              <w:bottom w:type="dxa" w:w="60"/>
+              <w:right w:type="dxa" w:w="100"/>
+            </w:tcMar>
+          </w:tcPr>
+          <w:p>
+            <w:pPr>
+              <w:spacing w:after="20"/>
+            </w:pPr>
+            <w:r>
+              <w:rPr>
+                <w:rFonts w:ascii="Arial" w:cs="Arial" w:eastAsia="Arial" w:hAnsi="Arial"/>
+                <w:sz w:val="19"/>
+                <w:szCs w:val="19"/>
+              </w:rPr>
+              <w:t xml:space="preserve">No impact on page speed: the chat code loads only after the page has loaded or when the button is clicked; ≤ 100 KB before opening; Core Web Vitals targets (section 8) still met.</w:t>
+            </w:r>
+          </w:p>
+        </w:tc>
+        <w:tc>
+          <w:tcPr>
+            <w:tcW w:type="dxa" w:w="1200"/>
+            <w:shd w:fill="FFFFFF" w:val="clear"/>
+            <w:tcMar>
+              <w:top w:type="dxa" w:w="60"/>
+              <w:left w:type="dxa" w:w="100"/>
+              <w:bottom w:type="dxa" w:w="60"/>
+              <w:right w:type="dxa" w:w="100"/>
+            </w:tcMar>
+          </w:tcPr>
+          <w:p>
+            <w:pPr>
+              <w:spacing w:after="20"/>
+            </w:pPr>
+            <w:r>
+              <w:rPr>
+                <w:rFonts w:ascii="Arial" w:cs="Arial" w:eastAsia="Arial" w:hAnsi="Arial"/>
+                <w:sz w:val="19"/>
+                <w:szCs w:val="19"/>
+              </w:rPr>
+              <w:t xml:space="preserve">MUST</w:t>
+            </w:r>
+          </w:p>
+        </w:tc>
+      </w:tr>
+      <w:tr>
+        <w:tc>
+          <w:tcPr>
+            <w:tcW w:type="dxa" w:w="700"/>
+            <w:shd w:fill="F6F8FA" w:val="clear"/>
+            <w:tcMar>
+              <w:top w:type="dxa" w:w="60"/>
+              <w:left w:type="dxa" w:w="100"/>
+              <w:bottom w:type="dxa" w:w="60"/>
+              <w:right w:type="dxa" w:w="100"/>
+            </w:tcMar>
+          </w:tcPr>
+          <w:p>
+            <w:pPr>
+              <w:spacing w:after="20"/>
+            </w:pPr>
+            <w:r>
+              <w:rPr>
+                <w:rFonts w:ascii="Arial" w:cs="Arial" w:eastAsia="Arial" w:hAnsi="Arial"/>
+                <w:sz w:val="19"/>
+                <w:szCs w:val="19"/>
+              </w:rPr>
+              <w:t xml:space="preserve">C17</w:t>
+            </w:r>
+          </w:p>
+        </w:tc>
+        <w:tc>
+          <w:tcPr>
+            <w:tcW w:type="dxa" w:w="7126"/>
+            <w:shd w:fill="F6F8FA" w:val="clear"/>
+            <w:tcMar>
+              <w:top w:type="dxa" w:w="60"/>
+              <w:left w:type="dxa" w:w="100"/>
+              <w:bottom w:type="dxa" w:w="60"/>
+              <w:right w:type="dxa" w:w="100"/>
+            </w:tcMar>
+          </w:tcPr>
+          <w:p>
+            <w:pPr>
+              <w:spacing w:after="20"/>
+            </w:pPr>
+            <w:r>
+              <w:rPr>
+                <w:rFonts w:ascii="Arial" w:cs="Arial" w:eastAsia="Arial" w:hAnsi="Arial"/>
+                <w:sz w:val="19"/>
+                <w:szCs w:val="19"/>
+              </w:rPr>
+              <w:t xml:space="preserve">If the chat service is unavailable, the button shows contact details instead – the website itself must never fail because of the chat.</w:t>
+            </w:r>
+          </w:p>
+        </w:tc>
+        <w:tc>
+          <w:tcPr>
+            <w:tcW w:type="dxa" w:w="1200"/>
+            <w:shd w:fill="F6F8FA" w:val="clear"/>
+            <w:tcMar>
+              <w:top w:type="dxa" w:w="60"/>
+              <w:left w:type="dxa" w:w="100"/>
+              <w:bottom w:type="dxa" w:w="60"/>
+              <w:right w:type="dxa" w:w="100"/>
+            </w:tcMar>
+          </w:tcPr>
+          <w:p>
+            <w:pPr>
+              <w:spacing w:after="20"/>
+            </w:pPr>
+            <w:r>
+              <w:rPr>
+                <w:rFonts w:ascii="Arial" w:cs="Arial" w:eastAsia="Arial" w:hAnsi="Arial"/>
+                <w:sz w:val="19"/>
+                <w:szCs w:val="19"/>
+              </w:rPr>
+              <w:t xml:space="preserve">MUST</w:t>
+            </w:r>
+          </w:p>
+        </w:tc>
+      </w:tr>
+      <w:tr>
+        <w:tc>
+          <w:tcPr>
+            <w:tcW w:type="dxa" w:w="700"/>
+            <w:shd w:fill="FFFFFF" w:val="clear"/>
+            <w:tcMar>
+              <w:top w:type="dxa" w:w="60"/>
+              <w:left w:type="dxa" w:w="100"/>
+              <w:bottom w:type="dxa" w:w="60"/>
+              <w:right w:type="dxa" w:w="100"/>
+            </w:tcMar>
+          </w:tcPr>
+          <w:p>
+            <w:pPr>
+              <w:spacing w:after="20"/>
+            </w:pPr>
+            <w:r>
+              <w:rPr>
+                <w:rFonts w:ascii="Arial" w:cs="Arial" w:eastAsia="Arial" w:hAnsi="Arial"/>
+                <w:sz w:val="19"/>
+                <w:szCs w:val="19"/>
+              </w:rPr>
+              <w:t xml:space="preserve">C18</w:t>
+            </w:r>
+          </w:p>
+        </w:tc>
+        <w:tc>
+          <w:tcPr>
+            <w:tcW w:type="dxa" w:w="7126"/>
+            <w:shd w:fill="FFFFFF" w:val="clear"/>
+            <w:tcMar>
+              <w:top w:type="dxa" w:w="60"/>
+              <w:left w:type="dxa" w:w="100"/>
+              <w:bottom w:type="dxa" w:w="60"/>
+              <w:right w:type="dxa" w:w="100"/>
+            </w:tcMar>
+          </w:tcPr>
+          <w:p>
+            <w:pPr>
+              <w:spacing w:after="20"/>
+            </w:pPr>
+            <w:r>
+              <w:rPr>
+                <w:rFonts w:ascii="Arial" w:cs="Arial" w:eastAsia="Arial" w:hAnsi="Arial"/>
+                <w:sz w:val="19"/>
+                <w:szCs w:val="19"/>
+              </w:rPr>
+              <w:t xml:space="preserve">Suggested starter questions per language (e.g. "Which wheel lathe suits a metro depot?", "Download a catalogue", "Contact service").</w:t>
+            </w:r>
+          </w:p>
+        </w:tc>
+        <w:tc>
+          <w:tcPr>
+            <w:tcW w:type="dxa" w:w="1200"/>
+            <w:shd w:fill="FFFFFF" w:val="clear"/>
+            <w:tcMar>
+              <w:top w:type="dxa" w:w="60"/>
+              <w:left w:type="dxa" w:w="100"/>
+              <w:bottom w:type="dxa" w:w="60"/>
+              <w:right w:type="dxa" w:w="100"/>
+            </w:tcMar>
+          </w:tcPr>
+          <w:p>
+            <w:pPr>
+              <w:spacing w:after="20"/>
+            </w:pPr>
+            <w:r>
+              <w:rPr>
+                <w:rFonts w:ascii="Arial" w:cs="Arial" w:eastAsia="Arial" w:hAnsi="Arial"/>
+                <w:sz w:val="19"/>
+                <w:szCs w:val="19"/>
+              </w:rPr>
+              <w:t xml:space="preserve">SHOULD</w:t>
+            </w:r>
+          </w:p>
+        </w:tc>
+      </w:tr>
+    </w:tbl>
+    <w:p>
+      <w:pPr>
+        <w:pStyle w:val="Heading2"/>
+        <w:spacing w:after="120" w:before="240"/>
+      </w:pPr>
+      <w:r>
+        <w:rPr>
+          <w:rFonts w:ascii="Arial" w:cs="Arial" w:eastAsia="Arial" w:hAnsi="Arial"/>
+        </w:rPr>
+        <w:t xml:space="preserve">7.4 Security, privacy and cost control</w:t>
+      </w:r>
+    </w:p>
+    <w:tbl>
+      <w:tblPr>
+        <w:tblW w:type="dxa" w:w="9026"/>
+        <w:tblBorders>
+          <w:top w:val="single" w:color="auto" w:sz="4"/>
+          <w:left w:val="single" w:color="auto" w:sz="4"/>
+          <w:bottom w:val="single" w:color="auto" w:sz="4"/>
+          <w:right w:val="single" w:color="auto" w:sz="4"/>
+          <w:insideH w:val="single" w:color="auto" w:sz="4"/>
+          <w:insideV w:val="single" w:color="auto" w:sz="4"/>
+        </w:tblBorders>
+      </w:tblPr>
+      <w:tblGrid>
+        <w:gridCol w:w="700"/>
+        <w:gridCol w:w="7126"/>
+        <w:gridCol w:w="1200"/>
+      </w:tblGrid>
+      <w:tr>
+        <w:trPr>
+          <w:tblHeader/>
+        </w:trPr>
+        <w:tc>
+          <w:tcPr>
+            <w:tcW w:type="dxa" w:w="700"/>
+            <w:shd w:fill="184A72" w:val="clear"/>
+            <w:tcMar>
+              <w:top w:type="dxa" w:w="60"/>
+              <w:left w:type="dxa" w:w="100"/>
+              <w:bottom w:type="dxa" w:w="60"/>
+              <w:right w:type="dxa" w:w="100"/>
+            </w:tcMar>
+          </w:tcPr>
+          <w:p>
+            <w:pPr>
+              <w:spacing w:after="20"/>
+            </w:pPr>
+            <w:r>
+              <w:rPr>
+                <w:rFonts w:ascii="Arial" w:cs="Arial" w:eastAsia="Arial" w:hAnsi="Arial"/>
+                <w:b/>
+                <w:bCs/>
+                <w:color w:val="FFFFFF"/>
+                <w:sz w:val="19"/>
+                <w:szCs w:val="19"/>
+              </w:rPr>
+              <w:t xml:space="preserve">#</w:t>
+            </w:r>
+          </w:p>
+        </w:tc>
+        <w:tc>
+          <w:tcPr>
+            <w:tcW w:type="dxa" w:w="7126"/>
+            <w:shd w:fill="184A72" w:val="clear"/>
+            <w:tcMar>
+              <w:top w:type="dxa" w:w="60"/>
+              <w:left w:type="dxa" w:w="100"/>
+              <w:bottom w:type="dxa" w:w="60"/>
+              <w:right w:type="dxa" w:w="100"/>
+            </w:tcMar>
+          </w:tcPr>
+          <w:p>
+            <w:pPr>
+              <w:spacing w:after="20"/>
+            </w:pPr>
+            <w:r>
+              <w:rPr>
+                <w:rFonts w:ascii="Arial" w:cs="Arial" w:eastAsia="Arial" w:hAnsi="Arial"/>
+                <w:b/>
+                <w:bCs/>
+                <w:color w:val="FFFFFF"/>
+                <w:sz w:val="19"/>
+                <w:szCs w:val="19"/>
+              </w:rPr>
+              <w:t xml:space="preserve">Requirement</w:t>
+            </w:r>
+          </w:p>
+        </w:tc>
+        <w:tc>
+          <w:tcPr>
+            <w:tcW w:type="dxa" w:w="1200"/>
+            <w:shd w:fill="184A72" w:val="clear"/>
+            <w:tcMar>
+              <w:top w:type="dxa" w:w="60"/>
+              <w:left w:type="dxa" w:w="100"/>
+              <w:bottom w:type="dxa" w:w="60"/>
+              <w:right w:type="dxa" w:w="100"/>
+            </w:tcMar>
+          </w:tcPr>
+          <w:p>
+            <w:pPr>
+              <w:spacing w:after="20"/>
+            </w:pPr>
+            <w:r>
+              <w:rPr>
+                <w:rFonts w:ascii="Arial" w:cs="Arial" w:eastAsia="Arial" w:hAnsi="Arial"/>
+                <w:b/>
+                <w:bCs/>
+                <w:color w:val="FFFFFF"/>
+                <w:sz w:val="19"/>
+                <w:szCs w:val="19"/>
+              </w:rPr>
+              <w:t xml:space="preserve">Priority</w:t>
+            </w:r>
+          </w:p>
+        </w:tc>
+      </w:tr>
+      <w:tr>
+        <w:tc>
+          <w:tcPr>
+            <w:tcW w:type="dxa" w:w="700"/>
+            <w:shd w:fill="FFFFFF" w:val="clear"/>
+            <w:tcMar>
+              <w:top w:type="dxa" w:w="60"/>
+              <w:left w:type="dxa" w:w="100"/>
+              <w:bottom w:type="dxa" w:w="60"/>
+              <w:right w:type="dxa" w:w="100"/>
+            </w:tcMar>
+          </w:tcPr>
+          <w:p>
+            <w:pPr>
+              <w:spacing w:after="20"/>
+            </w:pPr>
+            <w:r>
+              <w:rPr>
+                <w:rFonts w:ascii="Arial" w:cs="Arial" w:eastAsia="Arial" w:hAnsi="Arial"/>
+                <w:sz w:val="19"/>
+                <w:szCs w:val="19"/>
+              </w:rPr>
+              <w:t xml:space="preserve">C19</w:t>
+            </w:r>
+          </w:p>
+        </w:tc>
+        <w:tc>
+          <w:tcPr>
+            <w:tcW w:type="dxa" w:w="7126"/>
+            <w:shd w:fill="FFFFFF" w:val="clear"/>
+            <w:tcMar>
+              <w:top w:type="dxa" w:w="60"/>
+              <w:left w:type="dxa" w:w="100"/>
+              <w:bottom w:type="dxa" w:w="60"/>
+              <w:right w:type="dxa" w:w="100"/>
+            </w:tcMar>
+          </w:tcPr>
+          <w:p>
+            <w:pPr>
+              <w:spacing w:after="20"/>
+            </w:pPr>
+            <w:r>
+              <w:rPr>
+                <w:rFonts w:ascii="Arial" w:cs="Arial" w:eastAsia="Arial" w:hAnsi="Arial"/>
+                <w:sz w:val="19"/>
+                <w:szCs w:val="19"/>
+              </w:rPr>
+              <w:t xml:space="preserve">AI service keys are held only on the server side (proxy endpoint) – never in the website code. The Content-Security-Policy is extended only to the chat endpoint's domain.</w:t>
+            </w:r>
+          </w:p>
+        </w:tc>
+        <w:tc>
+          <w:tcPr>
+            <w:tcW w:type="dxa" w:w="1200"/>
+            <w:shd w:fill="FFFFFF" w:val="clear"/>
+            <w:tcMar>
+              <w:top w:type="dxa" w:w="60"/>
+              <w:left w:type="dxa" w:w="100"/>
+              <w:bottom w:type="dxa" w:w="60"/>
+              <w:right w:type="dxa" w:w="100"/>
+            </w:tcMar>
+          </w:tcPr>
+          <w:p>
+            <w:pPr>
+              <w:spacing w:after="20"/>
+            </w:pPr>
+            <w:r>
+              <w:rPr>
+                <w:rFonts w:ascii="Arial" w:cs="Arial" w:eastAsia="Arial" w:hAnsi="Arial"/>
+                <w:sz w:val="19"/>
+                <w:szCs w:val="19"/>
+              </w:rPr>
+              <w:t xml:space="preserve">MUST</w:t>
+            </w:r>
+          </w:p>
+        </w:tc>
+      </w:tr>
+      <w:tr>
+        <w:tc>
+          <w:tcPr>
+            <w:tcW w:type="dxa" w:w="700"/>
+            <w:shd w:fill="F6F8FA" w:val="clear"/>
+            <w:tcMar>
+              <w:top w:type="dxa" w:w="60"/>
+              <w:left w:type="dxa" w:w="100"/>
+              <w:bottom w:type="dxa" w:w="60"/>
+              <w:right w:type="dxa" w:w="100"/>
+            </w:tcMar>
+          </w:tcPr>
+          <w:p>
+            <w:pPr>
+              <w:spacing w:after="20"/>
+            </w:pPr>
+            <w:r>
+              <w:rPr>
+                <w:rFonts w:ascii="Arial" w:cs="Arial" w:eastAsia="Arial" w:hAnsi="Arial"/>
+                <w:sz w:val="19"/>
+                <w:szCs w:val="19"/>
+              </w:rPr>
+              <w:t xml:space="preserve">C20</w:t>
+            </w:r>
+          </w:p>
+        </w:tc>
+        <w:tc>
+          <w:tcPr>
+            <w:tcW w:type="dxa" w:w="7126"/>
+            <w:shd w:fill="F6F8FA" w:val="clear"/>
+            <w:tcMar>
+              <w:top w:type="dxa" w:w="60"/>
+              <w:left w:type="dxa" w:w="100"/>
+              <w:bottom w:type="dxa" w:w="60"/>
+              <w:right w:type="dxa" w:w="100"/>
+            </w:tcMar>
+          </w:tcPr>
+          <w:p>
+            <w:pPr>
+              <w:spacing w:after="20"/>
+            </w:pPr>
+            <w:r>
+              <w:rPr>
+                <w:rFonts w:ascii="Arial" w:cs="Arial" w:eastAsia="Arial" w:hAnsi="Arial"/>
+                <w:sz w:val="19"/>
+                <w:szCs w:val="19"/>
+              </w:rPr>
+              <w:t xml:space="preserve">Abuse protection: rate limits per visitor/IP, maximum message length, bot/CAPTCHA check before high-volume use, blocking of abusive sessions, and protection against prompt-injection (the assistant cannot be instructed to reveal its configuration, change its rules or access other systems).</w:t>
+            </w:r>
+          </w:p>
+        </w:tc>
+        <w:tc>
+          <w:tcPr>
+            <w:tcW w:type="dxa" w:w="1200"/>
+            <w:shd w:fill="F6F8FA" w:val="clear"/>
+            <w:tcMar>
+              <w:top w:type="dxa" w:w="60"/>
+              <w:left w:type="dxa" w:w="100"/>
+              <w:bottom w:type="dxa" w:w="60"/>
+              <w:right w:type="dxa" w:w="100"/>
+            </w:tcMar>
+          </w:tcPr>
+          <w:p>
+            <w:pPr>
+              <w:spacing w:after="20"/>
+            </w:pPr>
+            <w:r>
+              <w:rPr>
+                <w:rFonts w:ascii="Arial" w:cs="Arial" w:eastAsia="Arial" w:hAnsi="Arial"/>
+                <w:sz w:val="19"/>
+                <w:szCs w:val="19"/>
+              </w:rPr>
+              <w:t xml:space="preserve">MUST</w:t>
+            </w:r>
+          </w:p>
+        </w:tc>
+      </w:tr>
+      <w:tr>
+        <w:tc>
+          <w:tcPr>
+            <w:tcW w:type="dxa" w:w="700"/>
+            <w:shd w:fill="FFFFFF" w:val="clear"/>
+            <w:tcMar>
+              <w:top w:type="dxa" w:w="60"/>
+              <w:left w:type="dxa" w:w="100"/>
+              <w:bottom w:type="dxa" w:w="60"/>
+              <w:right w:type="dxa" w:w="100"/>
+            </w:tcMar>
+          </w:tcPr>
+          <w:p>
+            <w:pPr>
+              <w:spacing w:after="20"/>
+            </w:pPr>
+            <w:r>
+              <w:rPr>
+                <w:rFonts w:ascii="Arial" w:cs="Arial" w:eastAsia="Arial" w:hAnsi="Arial"/>
+                <w:sz w:val="19"/>
+                <w:szCs w:val="19"/>
+              </w:rPr>
+              <w:t xml:space="preserve">C21</w:t>
+            </w:r>
+          </w:p>
+        </w:tc>
+        <w:tc>
+          <w:tcPr>
+            <w:tcW w:type="dxa" w:w="7126"/>
+            <w:shd w:fill="FFFFFF" w:val="clear"/>
+            <w:tcMar>
+              <w:top w:type="dxa" w:w="60"/>
+              <w:left w:type="dxa" w:w="100"/>
+              <w:bottom w:type="dxa" w:w="60"/>
+              <w:right w:type="dxa" w:w="100"/>
+            </w:tcMar>
+          </w:tcPr>
+          <w:p>
+            <w:pPr>
+              <w:spacing w:after="20"/>
+            </w:pPr>
+            <w:r>
+              <w:rPr>
+                <w:rFonts w:ascii="Arial" w:cs="Arial" w:eastAsia="Arial" w:hAnsi="Arial"/>
+                <w:sz w:val="19"/>
+                <w:szCs w:val="19"/>
+              </w:rPr>
+              <w:t xml:space="preserve">Cost control: monthly usage cap set by HYT, alerts at 50 % and 80 %, and automatic fall-back to contact details when the cap is reached.</w:t>
+            </w:r>
+          </w:p>
+        </w:tc>
+        <w:tc>
+          <w:tcPr>
+            <w:tcW w:type="dxa" w:w="1200"/>
+            <w:shd w:fill="FFFFFF" w:val="clear"/>
+            <w:tcMar>
+              <w:top w:type="dxa" w:w="60"/>
+              <w:left w:type="dxa" w:w="100"/>
+              <w:bottom w:type="dxa" w:w="60"/>
+              <w:right w:type="dxa" w:w="100"/>
+            </w:tcMar>
+          </w:tcPr>
+          <w:p>
+            <w:pPr>
+              <w:spacing w:after="20"/>
+            </w:pPr>
+            <w:r>
+              <w:rPr>
+                <w:rFonts w:ascii="Arial" w:cs="Arial" w:eastAsia="Arial" w:hAnsi="Arial"/>
+                <w:sz w:val="19"/>
+                <w:szCs w:val="19"/>
+              </w:rPr>
+              <w:t xml:space="preserve">MUST</w:t>
+            </w:r>
+          </w:p>
+        </w:tc>
+      </w:tr>
+      <w:tr>
+        <w:tc>
+          <w:tcPr>
+            <w:tcW w:type="dxa" w:w="700"/>
+            <w:shd w:fill="F6F8FA" w:val="clear"/>
+            <w:tcMar>
+              <w:top w:type="dxa" w:w="60"/>
+              <w:left w:type="dxa" w:w="100"/>
+              <w:bottom w:type="dxa" w:w="60"/>
+              <w:right w:type="dxa" w:w="100"/>
+            </w:tcMar>
+          </w:tcPr>
+          <w:p>
+            <w:pPr>
+              <w:spacing w:after="20"/>
+            </w:pPr>
+            <w:r>
+              <w:rPr>
+                <w:rFonts w:ascii="Arial" w:cs="Arial" w:eastAsia="Arial" w:hAnsi="Arial"/>
+                <w:sz w:val="19"/>
+                <w:szCs w:val="19"/>
+              </w:rPr>
+              <w:t xml:space="preserve">C22</w:t>
+            </w:r>
+          </w:p>
+        </w:tc>
+        <w:tc>
+          <w:tcPr>
+            <w:tcW w:type="dxa" w:w="7126"/>
+            <w:shd w:fill="F6F8FA" w:val="clear"/>
+            <w:tcMar>
+              <w:top w:type="dxa" w:w="60"/>
+              <w:left w:type="dxa" w:w="100"/>
+              <w:bottom w:type="dxa" w:w="60"/>
+              <w:right w:type="dxa" w:w="100"/>
+            </w:tcMar>
+          </w:tcPr>
+          <w:p>
+            <w:pPr>
+              <w:spacing w:after="20"/>
+            </w:pPr>
+            <w:r>
+              <w:rPr>
+                <w:rFonts w:ascii="Arial" w:cs="Arial" w:eastAsia="Arial" w:hAnsi="Arial"/>
+                <w:sz w:val="19"/>
+                <w:szCs w:val="19"/>
+              </w:rPr>
+              <w:t xml:space="preserve">Privacy notice shown before the first message; the visitor accepts it to start chatting. The Privacy Policy names the AI provider and retention period.</w:t>
+            </w:r>
+          </w:p>
+        </w:tc>
+        <w:tc>
+          <w:tcPr>
+            <w:tcW w:type="dxa" w:w="1200"/>
+            <w:shd w:fill="F6F8FA" w:val="clear"/>
+            <w:tcMar>
+              <w:top w:type="dxa" w:w="60"/>
+              <w:left w:type="dxa" w:w="100"/>
+              <w:bottom w:type="dxa" w:w="60"/>
+              <w:right w:type="dxa" w:w="100"/>
+            </w:tcMar>
+          </w:tcPr>
+          <w:p>
+            <w:pPr>
+              <w:spacing w:after="20"/>
+            </w:pPr>
+            <w:r>
+              <w:rPr>
+                <w:rFonts w:ascii="Arial" w:cs="Arial" w:eastAsia="Arial" w:hAnsi="Arial"/>
+                <w:sz w:val="19"/>
+                <w:szCs w:val="19"/>
+              </w:rPr>
+              <w:t xml:space="preserve">MUST</w:t>
+            </w:r>
+          </w:p>
+        </w:tc>
+      </w:tr>
+      <w:tr>
+        <w:tc>
+          <w:tcPr>
+            <w:tcW w:type="dxa" w:w="700"/>
+            <w:shd w:fill="FFFFFF" w:val="clear"/>
+            <w:tcMar>
+              <w:top w:type="dxa" w:w="60"/>
+              <w:left w:type="dxa" w:w="100"/>
+              <w:bottom w:type="dxa" w:w="60"/>
+              <w:right w:type="dxa" w:w="100"/>
+            </w:tcMar>
+          </w:tcPr>
+          <w:p>
+            <w:pPr>
+              <w:spacing w:after="20"/>
+            </w:pPr>
+            <w:r>
+              <w:rPr>
+                <w:rFonts w:ascii="Arial" w:cs="Arial" w:eastAsia="Arial" w:hAnsi="Arial"/>
+                <w:sz w:val="19"/>
+                <w:szCs w:val="19"/>
+              </w:rPr>
+              <w:t xml:space="preserve">C23</w:t>
+            </w:r>
+          </w:p>
+        </w:tc>
+        <w:tc>
+          <w:tcPr>
+            <w:tcW w:type="dxa" w:w="7126"/>
+            <w:shd w:fill="FFFFFF" w:val="clear"/>
+            <w:tcMar>
+              <w:top w:type="dxa" w:w="60"/>
+              <w:left w:type="dxa" w:w="100"/>
+              <w:bottom w:type="dxa" w:w="60"/>
+              <w:right w:type="dxa" w:w="100"/>
+            </w:tcMar>
+          </w:tcPr>
+          <w:p>
+            <w:pPr>
+              <w:spacing w:after="20"/>
+            </w:pPr>
+            <w:r>
+              <w:rPr>
+                <w:rFonts w:ascii="Arial" w:cs="Arial" w:eastAsia="Arial" w:hAnsi="Arial"/>
+                <w:sz w:val="19"/>
+                <w:szCs w:val="19"/>
+              </w:rPr>
+              <w:t xml:space="preserve">Conversation logs: stored in the agreed region, access-controlled (MFA), personal data masked where possible, retained max. 90 days unless converted to a lead; visitors can request deletion.</w:t>
+            </w:r>
+          </w:p>
+        </w:tc>
+        <w:tc>
+          <w:tcPr>
+            <w:tcW w:type="dxa" w:w="1200"/>
+            <w:shd w:fill="FFFFFF" w:val="clear"/>
+            <w:tcMar>
+              <w:top w:type="dxa" w:w="60"/>
+              <w:left w:type="dxa" w:w="100"/>
+              <w:bottom w:type="dxa" w:w="60"/>
+              <w:right w:type="dxa" w:w="100"/>
+            </w:tcMar>
+          </w:tcPr>
+          <w:p>
+            <w:pPr>
+              <w:spacing w:after="20"/>
+            </w:pPr>
+            <w:r>
+              <w:rPr>
+                <w:rFonts w:ascii="Arial" w:cs="Arial" w:eastAsia="Arial" w:hAnsi="Arial"/>
+                <w:sz w:val="19"/>
+                <w:szCs w:val="19"/>
+              </w:rPr>
+              <w:t xml:space="preserve">MUST</w:t>
+            </w:r>
+          </w:p>
+        </w:tc>
+      </w:tr>
+      <w:tr>
+        <w:tc>
+          <w:tcPr>
+            <w:tcW w:type="dxa" w:w="700"/>
+            <w:shd w:fill="F6F8FA" w:val="clear"/>
+            <w:tcMar>
+              <w:top w:type="dxa" w:w="60"/>
+              <w:left w:type="dxa" w:w="100"/>
+              <w:bottom w:type="dxa" w:w="60"/>
+              <w:right w:type="dxa" w:w="100"/>
+            </w:tcMar>
+          </w:tcPr>
+          <w:p>
+            <w:pPr>
+              <w:spacing w:after="20"/>
+            </w:pPr>
+            <w:r>
+              <w:rPr>
+                <w:rFonts w:ascii="Arial" w:cs="Arial" w:eastAsia="Arial" w:hAnsi="Arial"/>
+                <w:sz w:val="19"/>
+                <w:szCs w:val="19"/>
+              </w:rPr>
+              <w:t xml:space="preserve">C24</w:t>
+            </w:r>
+          </w:p>
+        </w:tc>
+        <w:tc>
+          <w:tcPr>
+            <w:tcW w:type="dxa" w:w="7126"/>
+            <w:shd w:fill="F6F8FA" w:val="clear"/>
+            <w:tcMar>
+              <w:top w:type="dxa" w:w="60"/>
+              <w:left w:type="dxa" w:w="100"/>
+              <w:bottom w:type="dxa" w:w="60"/>
+              <w:right w:type="dxa" w:w="100"/>
+            </w:tcMar>
+          </w:tcPr>
+          <w:p>
+            <w:pPr>
+              <w:spacing w:after="20"/>
+            </w:pPr>
+            <w:r>
+              <w:rPr>
+                <w:rFonts w:ascii="Arial" w:cs="Arial" w:eastAsia="Arial" w:hAnsi="Arial"/>
+                <w:sz w:val="19"/>
+                <w:szCs w:val="19"/>
+              </w:rPr>
+              <w:t xml:space="preserve">The AI provider must not use HYT conversations or content to train its models; a data processing agreement covering DPDP Act 2023 and GDPR is required.</w:t>
+            </w:r>
+          </w:p>
+        </w:tc>
+        <w:tc>
+          <w:tcPr>
+            <w:tcW w:type="dxa" w:w="1200"/>
+            <w:shd w:fill="F6F8FA" w:val="clear"/>
+            <w:tcMar>
+              <w:top w:type="dxa" w:w="60"/>
+              <w:left w:type="dxa" w:w="100"/>
+              <w:bottom w:type="dxa" w:w="60"/>
+              <w:right w:type="dxa" w:w="100"/>
+            </w:tcMar>
+          </w:tcPr>
+          <w:p>
+            <w:pPr>
+              <w:spacing w:after="20"/>
+            </w:pPr>
+            <w:r>
+              <w:rPr>
+                <w:rFonts w:ascii="Arial" w:cs="Arial" w:eastAsia="Arial" w:hAnsi="Arial"/>
+                <w:sz w:val="19"/>
+                <w:szCs w:val="19"/>
+              </w:rPr>
+              <w:t xml:space="preserve">MUST</w:t>
+            </w:r>
+          </w:p>
+        </w:tc>
+      </w:tr>
+      <w:tr>
+        <w:tc>
+          <w:tcPr>
+            <w:tcW w:type="dxa" w:w="700"/>
+            <w:shd w:fill="FFFFFF" w:val="clear"/>
+            <w:tcMar>
+              <w:top w:type="dxa" w:w="60"/>
+              <w:left w:type="dxa" w:w="100"/>
+              <w:bottom w:type="dxa" w:w="60"/>
+              <w:right w:type="dxa" w:w="100"/>
+            </w:tcMar>
+          </w:tcPr>
+          <w:p>
+            <w:pPr>
+              <w:spacing w:after="20"/>
+            </w:pPr>
+            <w:r>
+              <w:rPr>
+                <w:rFonts w:ascii="Arial" w:cs="Arial" w:eastAsia="Arial" w:hAnsi="Arial"/>
+                <w:sz w:val="19"/>
+                <w:szCs w:val="19"/>
+              </w:rPr>
+              <w:t xml:space="preserve">C25</w:t>
+            </w:r>
+          </w:p>
+        </w:tc>
+        <w:tc>
+          <w:tcPr>
+            <w:tcW w:type="dxa" w:w="7126"/>
+            <w:shd w:fill="FFFFFF" w:val="clear"/>
+            <w:tcMar>
+              <w:top w:type="dxa" w:w="60"/>
+              <w:left w:type="dxa" w:w="100"/>
+              <w:bottom w:type="dxa" w:w="60"/>
+              <w:right w:type="dxa" w:w="100"/>
+            </w:tcMar>
+          </w:tcPr>
+          <w:p>
+            <w:pPr>
+              <w:spacing w:after="20"/>
+            </w:pPr>
+            <w:r>
+              <w:rPr>
+                <w:rFonts w:ascii="Arial" w:cs="Arial" w:eastAsia="Arial" w:hAnsi="Arial"/>
+                <w:sz w:val="19"/>
+                <w:szCs w:val="19"/>
+              </w:rPr>
+              <w:t xml:space="preserve">The assistant has read-only access to public website content only – no access to HYT internal systems, email, ERP or customer data.</w:t>
+            </w:r>
+          </w:p>
+        </w:tc>
+        <w:tc>
+          <w:tcPr>
+            <w:tcW w:type="dxa" w:w="1200"/>
+            <w:shd w:fill="FFFFFF" w:val="clear"/>
+            <w:tcMar>
+              <w:top w:type="dxa" w:w="60"/>
+              <w:left w:type="dxa" w:w="100"/>
+              <w:bottom w:type="dxa" w:w="60"/>
+              <w:right w:type="dxa" w:w="100"/>
+            </w:tcMar>
+          </w:tcPr>
+          <w:p>
+            <w:pPr>
+              <w:spacing w:after="20"/>
+            </w:pPr>
+            <w:r>
+              <w:rPr>
+                <w:rFonts w:ascii="Arial" w:cs="Arial" w:eastAsia="Arial" w:hAnsi="Arial"/>
+                <w:sz w:val="19"/>
+                <w:szCs w:val="19"/>
+              </w:rPr>
+              <w:t xml:space="preserve">MUST</w:t>
+            </w:r>
+          </w:p>
+        </w:tc>
+      </w:tr>
+    </w:tbl>
+    <w:p>
+      <w:pPr>
+        <w:pStyle w:val="Heading2"/>
+        <w:spacing w:after="120" w:before="240"/>
+      </w:pPr>
+      <w:r>
+        <w:rPr>
+          <w:rFonts w:ascii="Arial" w:cs="Arial" w:eastAsia="Arial" w:hAnsi="Arial"/>
+        </w:rPr>
+        <w:t xml:space="preserve">7.5 Administration and reporting</w:t>
+      </w:r>
+    </w:p>
+    <w:p>
+      <w:pPr>
+        <w:pStyle w:val="ListParagraph"/>
+        <w:numPr>
+          <w:ilvl w:val="0"/>
+          <w:numId w:val="2"/>
+        </w:numPr>
+        <w:spacing w:after="60" w:line="264"/>
+      </w:pPr>
+      <w:r>
+        <w:rPr>
+          <w:rFonts w:ascii="Arial" w:cs="Arial" w:eastAsia="Arial" w:hAnsi="Arial"/>
+          <w:sz w:val="21"/>
+          <w:szCs w:val="21"/>
+        </w:rPr>
+        <w:t xml:space="preserve">Admin dashboard for HYT: conversations, leads, questions the assistant could not answer, satisfaction (thumbs up/down).</w:t>
+      </w:r>
+    </w:p>
+    <w:p>
+      <w:pPr>
+        <w:pStyle w:val="ListParagraph"/>
+        <w:numPr>
+          <w:ilvl w:val="0"/>
+          <w:numId w:val="2"/>
+        </w:numPr>
+        <w:spacing w:after="60" w:line="264"/>
+      </w:pPr>
+      <w:r>
+        <w:rPr>
+          <w:rFonts w:ascii="Arial" w:cs="Arial" w:eastAsia="Arial" w:hAnsi="Arial"/>
+          <w:sz w:val="21"/>
+          <w:szCs w:val="21"/>
+        </w:rPr>
+        <w:t xml:space="preserve">Monthly report: number of conversations per language, top topics, leads generated, hand-overs, unanswered questions and recommended content improvements.</w:t>
+      </w:r>
+    </w:p>
+    <w:p>
+      <w:pPr>
+        <w:pStyle w:val="ListParagraph"/>
+        <w:numPr>
+          <w:ilvl w:val="0"/>
+          <w:numId w:val="2"/>
+        </w:numPr>
+        <w:spacing w:after="60" w:line="264"/>
+      </w:pPr>
+      <w:r>
+        <w:rPr>
+          <w:rFonts w:ascii="Arial" w:cs="Arial" w:eastAsia="Arial" w:hAnsi="Arial"/>
+          <w:sz w:val="21"/>
+          <w:szCs w:val="21"/>
+        </w:rPr>
+        <w:t xml:space="preserve">HYT can edit approved answers for frequent questions, the greeting and starter questions without developer help.</w:t>
+      </w:r>
+    </w:p>
+    <w:p>
+      <w:pPr>
+        <w:pStyle w:val="ListParagraph"/>
+        <w:numPr>
+          <w:ilvl w:val="0"/>
+          <w:numId w:val="2"/>
+        </w:numPr>
+        <w:spacing w:after="60" w:line="264"/>
+      </w:pPr>
+      <w:r>
+        <w:rPr>
+          <w:rFonts w:ascii="Arial" w:cs="Arial" w:eastAsia="Arial" w:hAnsi="Arial"/>
+          <w:sz w:val="21"/>
+          <w:szCs w:val="21"/>
+        </w:rPr>
+        <w:t xml:space="preserve">Quality review: the vendor checks a sample of conversations every month and corrects wrong answers within 5 business days.</w:t>
+      </w:r>
+    </w:p>
+    <w:p>
+      <w:pPr>
+        <w:pStyle w:val="Heading1"/>
+        <w:spacing w:after="160" w:before="360"/>
+      </w:pPr>
+      <w:r>
+        <w:rPr>
+          <w:rFonts w:ascii="Arial" w:cs="Arial" w:eastAsia="Arial" w:hAnsi="Arial"/>
+        </w:rPr>
+        <w:t xml:space="preserve">8. Performance, accessibility and compatibility</w:t>
       </w:r>
     </w:p>
     <w:tbl>
@@ -9251,7 +11900,7 @@
         <w:rPr>
           <w:rFonts w:ascii="Arial" w:cs="Arial" w:eastAsia="Arial" w:hAnsi="Arial"/>
         </w:rPr>
-        <w:t xml:space="preserve">8. SEO and launch requirements</w:t>
+        <w:t xml:space="preserve">9. SEO and launch requirements</w:t>
       </w:r>
     </w:p>
     <w:p>
@@ -9353,7 +12002,7 @@
         <w:rPr>
           <w:rFonts w:ascii="Arial" w:cs="Arial" w:eastAsia="Arial" w:hAnsi="Arial"/>
         </w:rPr>
-        <w:t xml:space="preserve">9. Maintenance and support (SLA)</w:t>
+        <w:t xml:space="preserve">10. Maintenance and support (SLA)</w:t>
       </w:r>
     </w:p>
     <w:tbl>
@@ -9986,7 +12635,7 @@
         <w:rPr>
           <w:rFonts w:ascii="Arial" w:cs="Arial" w:eastAsia="Arial" w:hAnsi="Arial"/>
         </w:rPr>
-        <w:t xml:space="preserve">10. Deliverables and acceptance criteria</w:t>
+        <w:t xml:space="preserve">11. Deliverables and acceptance criteria</w:t>
       </w:r>
     </w:p>
     <w:tbl>
@@ -10629,7 +13278,7 @@
                 <w:sz w:val="19"/>
                 <w:szCs w:val="19"/>
               </w:rPr>
-              <w:t xml:space="preserve">Section 7 targets met on home, one product page and contact page</w:t>
+              <w:t xml:space="preserve">Section 8 targets met on home, one product page and contact page</w:t>
             </w:r>
           </w:p>
         </w:tc>
@@ -10810,6 +13459,83 @@
                 <w:sz w:val="19"/>
                 <w:szCs w:val="19"/>
               </w:rPr>
+              <w:t xml:space="preserve">A11</w:t>
+            </w:r>
+          </w:p>
+        </w:tc>
+        <w:tc>
+          <w:tcPr>
+            <w:tcW w:type="dxa" w:w="2200"/>
+            <w:shd w:fill="F6F8FA" w:val="clear"/>
+            <w:tcMar>
+              <w:top w:type="dxa" w:w="60"/>
+              <w:left w:type="dxa" w:w="100"/>
+              <w:bottom w:type="dxa" w:w="60"/>
+              <w:right w:type="dxa" w:w="100"/>
+            </w:tcMar>
+          </w:tcPr>
+          <w:p>
+            <w:pPr>
+              <w:spacing w:after="20"/>
+            </w:pPr>
+            <w:r>
+              <w:rPr>
+                <w:rFonts w:ascii="Arial" w:cs="Arial" w:eastAsia="Arial" w:hAnsi="Arial"/>
+                <w:sz w:val="19"/>
+                <w:szCs w:val="19"/>
+              </w:rPr>
+              <w:t xml:space="preserve">AI chat assistant</w:t>
+            </w:r>
+          </w:p>
+        </w:tc>
+        <w:tc>
+          <w:tcPr>
+            <w:tcW w:type="dxa" w:w="6126"/>
+            <w:shd w:fill="F6F8FA" w:val="clear"/>
+            <w:tcMar>
+              <w:top w:type="dxa" w:w="60"/>
+              <w:left w:type="dxa" w:w="100"/>
+              <w:bottom w:type="dxa" w:w="60"/>
+              <w:right w:type="dxa" w:w="100"/>
+            </w:tcMar>
+          </w:tcPr>
+          <w:p>
+            <w:pPr>
+              <w:spacing w:after="20"/>
+            </w:pPr>
+            <w:r>
+              <w:rPr>
+                <w:rFonts w:ascii="Arial" w:cs="Arial" w:eastAsia="Arial" w:hAnsi="Arial"/>
+                <w:sz w:val="19"/>
+                <w:szCs w:val="19"/>
+              </w:rPr>
+              <w:t xml:space="preserve">Test set of at least 40 questions per language (EN, DE, FR, IT, NL) answered correctly from website content in ≥ 90 % of cases; 0 invented specifications, prices or delivery times; hand-over to a human works; widget passes accessibility test; site works normally if the chat service is down</w:t>
+            </w:r>
+          </w:p>
+        </w:tc>
+      </w:tr>
+      <w:tr>
+        <w:tc>
+          <w:tcPr>
+            <w:tcW w:type="dxa" w:w="700"/>
+            <w:shd w:fill="FFFFFF" w:val="clear"/>
+            <w:tcMar>
+              <w:top w:type="dxa" w:w="60"/>
+              <w:left w:type="dxa" w:w="100"/>
+              <w:bottom w:type="dxa" w:w="60"/>
+              <w:right w:type="dxa" w:w="100"/>
+            </w:tcMar>
+          </w:tcPr>
+          <w:p>
+            <w:pPr>
+              <w:spacing w:after="20"/>
+            </w:pPr>
+            <w:r>
+              <w:rPr>
+                <w:rFonts w:ascii="Arial" w:cs="Arial" w:eastAsia="Arial" w:hAnsi="Arial"/>
+                <w:sz w:val="19"/>
+                <w:szCs w:val="19"/>
+              </w:rPr>
               <w:t xml:space="preserve">A10</w:t>
             </w:r>
           </w:p>
@@ -10817,7 +13543,7 @@
         <w:tc>
           <w:tcPr>
             <w:tcW w:type="dxa" w:w="2200"/>
-            <w:shd w:fill="F6F8FA" w:val="clear"/>
+            <w:shd w:fill="FFFFFF" w:val="clear"/>
             <w:tcMar>
               <w:top w:type="dxa" w:w="60"/>
               <w:left w:type="dxa" w:w="100"/>
@@ -10842,7 +13568,7 @@
         <w:tc>
           <w:tcPr>
             <w:tcW w:type="dxa" w:w="6126"/>
-            <w:shd w:fill="F6F8FA" w:val="clear"/>
+            <w:shd w:fill="FFFFFF" w:val="clear"/>
             <w:tcMar>
               <w:top w:type="dxa" w:w="60"/>
               <w:left w:type="dxa" w:w="100"/>
@@ -10875,7 +13601,7 @@
         <w:rPr>
           <w:rFonts w:ascii="Arial" w:cs="Arial" w:eastAsia="Arial" w:hAnsi="Arial"/>
         </w:rPr>
-        <w:t xml:space="preserve">11. What the vendor must include in the quotation</w:t>
+        <w:t xml:space="preserve">12. What the vendor must include in the quotation</w:t>
       </w:r>
     </w:p>
     <w:p>
@@ -11001,6 +13727,24 @@
           <w:sz w:val="21"/>
           <w:szCs w:val="21"/>
         </w:rPr>
+        <w:t xml:space="preserve">AI chat assistant: proposed platform/AI provider, data location, set-up cost, monthly running cost at 1,000 / 5,000 / 20,000 conversations, cost caps, and how the knowledge base is kept in sync with the website.</w:t>
+      </w:r>
+    </w:p>
+    <w:p>
+      <w:pPr>
+        <w:pStyle w:val="ListParagraph"/>
+        <w:numPr>
+          <w:ilvl w:val="0"/>
+          <w:numId w:val="2"/>
+        </w:numPr>
+        <w:spacing w:after="60" w:line="264"/>
+      </w:pPr>
+      <w:r>
+        <w:rPr>
+          <w:rFonts w:ascii="Arial" w:cs="Arial" w:eastAsia="Arial" w:hAnsi="Arial"/>
+          <w:sz w:val="21"/>
+          <w:szCs w:val="21"/>
+        </w:rPr>
         <w:t xml:space="preserve">SLA, support hours, escalation contacts and references from similar corporate or multilingual websites.</w:t>
       </w:r>
     </w:p>
@@ -11013,7 +13757,7 @@
         <w:rPr>
           <w:rFonts w:ascii="Arial" w:cs="Arial" w:eastAsia="Arial" w:hAnsi="Arial"/>
         </w:rPr>
-        <w:t xml:space="preserve">12. Items HYT will provide</w:t>
+        <w:t xml:space="preserve">13. Items HYT will provide</w:t>
       </w:r>
     </w:p>
     <w:p>
@@ -11103,7 +13847,25 @@
           <w:sz w:val="21"/>
           <w:szCs w:val="21"/>
         </w:rPr>
-        <w:t xml:space="preserve">Legal review of Privacy Policy, Cookie Policy and Disclaimer (form processor name, retention periods).</w:t>
+        <w:t xml:space="preserve">Legal review of Privacy Policy, Cookie Policy and Disclaimer (form processor name, AI chat provider, retention periods).</w:t>
+      </w:r>
+    </w:p>
+    <w:p>
+      <w:pPr>
+        <w:pStyle w:val="ListParagraph"/>
+        <w:numPr>
+          <w:ilvl w:val="0"/>
+          <w:numId w:val="2"/>
+        </w:numPr>
+        <w:spacing w:after="60" w:line="264"/>
+      </w:pPr>
+      <w:r>
+        <w:rPr>
+          <w:rFonts w:ascii="Arial" w:cs="Arial" w:eastAsia="Arial" w:hAnsi="Arial"/>
+          <w:sz w:val="21"/>
+          <w:szCs w:val="21"/>
+        </w:rPr>
+        <w:t xml:space="preserve">For the AI chat assistant: approved list of topics it may answer, escalation contacts and office hours, and a set of typical visitor questions for testing.</w:t>
       </w:r>
     </w:p>
     <w:p>

</xml_diff>